<commit_message>
CORRECTION: FCDA statutory 25% infrastructure reserve was under-allocated (8ha vs required ~19ha). Corrected land use across 27-page business plan + 3-page teaser: residential zone 22ha->11ha, plot count 500->120, duplex sales now counted in base case (previously excluded), Phase 1 revenue 50B->40B, ROI 186%->128.6%
</commit_message>
<xml_diff>
--- a/golf-estate/The_77_Golf_and_Country_Estate_Business_Plan.docx
+++ b/golf-estate/The_77_Golf_and_Country_Estate_Business_Plan.docx
@@ -38,6 +38,19 @@
           <w:szCs w:val="56"/>
         </w:rPr>
         <w:t xml:space="preserve">THE 77 GOLF &amp; COUNTRY ESTATE</w:t>
+      </w:r>
+    </w:p>
+    <w:p>
+      <w:pPr>
+        <w:jc w:val="left"/>
+      </w:pPr>
+      <w:r>
+        <w:rPr>
+          <w:b/>
+          <w:color w:val="B00000"/>
+          <w:sz w:val="22"/>
+        </w:rPr>
+        <w:t>CORRECTED VERSION — Sep 13, 2026: This revision fixes a material land-use gap in the original draft. The FCDA requires a minimum 25% of gross site area (19 ha of this 77 ha site) reserved for statutory infrastructure (roads, drainage, utilities, public open space) before layout approval — the original draft only allocated 8 ha to this. Correcting it shrinks the Golf Estate Residential zone from 22 ha to 11 ha, cuts the modeled serviced-plot count from 500 to 120, and for the first time brings duplex unit sales into the base-case revenue line (previously excluded) to keep the project viable. Revised Phase 1 base-case revenue: ₦40 billion (was ₦50 billion). Revised ROI: ≈128.6% (was ≈186%). See Section 3 and Section 9–10 for full detail.</w:t>
       </w:r>
     </w:p>
     <w:p>
@@ -1052,6 +1065,56 @@
             <w:vAlign w:val="center"/>
           </w:tcPr>
           <w:p>
+            <w:r>
+              <w:t>Projected Phase 1 Revenue (Plot + Duplex Sales)</w:t>
+            </w:r>
+          </w:p>
+        </w:tc>
+        <w:tc>
+          <w:tcPr>
+            <w:tcW w:type="dxa" w:w="5400"/>
+            <w:tcBorders>
+              <w:top w:val="single" w:color="CCCCCC" w:sz="2"/>
+              <w:left w:val="single" w:color="CCCCCC" w:sz="2"/>
+              <w:bottom w:val="single" w:color="CCCCCC" w:sz="2"/>
+              <w:right w:val="single" w:color="CCCCCC" w:sz="2"/>
+            </w:tcBorders>
+            <w:shd w:fill="FFFFFF" w:val="clear"/>
+            <w:tcMar>
+              <w:top w:type="dxa" w:w="80"/>
+              <w:left w:type="dxa" w:w="120"/>
+              <w:bottom w:type="dxa" w:w="80"/>
+              <w:right w:type="dxa" w:w="120"/>
+            </w:tcMar>
+            <w:vAlign w:val="center"/>
+          </w:tcPr>
+          <w:p>
+            <w:r>
+              <w:t>₦40 billion</w:t>
+            </w:r>
+          </w:p>
+        </w:tc>
+      </w:tr>
+      <w:tr>
+        <w:tc>
+          <w:tcPr>
+            <w:tcW w:type="dxa" w:w="4680"/>
+            <w:tcBorders>
+              <w:top w:val="single" w:color="CCCCCC" w:sz="2"/>
+              <w:left w:val="single" w:color="CCCCCC" w:sz="2"/>
+              <w:bottom w:val="single" w:color="CCCCCC" w:sz="2"/>
+              <w:right w:val="single" w:color="CCCCCC" w:sz="2"/>
+            </w:tcBorders>
+            <w:shd w:fill="F7F7F7" w:val="clear"/>
+            <w:tcMar>
+              <w:top w:type="dxa" w:w="80"/>
+              <w:left w:type="dxa" w:w="120"/>
+              <w:bottom w:type="dxa" w:w="80"/>
+              <w:right w:type="dxa" w:w="120"/>
+            </w:tcMar>
+            <w:vAlign w:val="center"/>
+          </w:tcPr>
+          <w:p>
             <w:pPr>
               <w:jc w:val="left"/>
             </w:pPr>
@@ -1063,7 +1126,7 @@
                 <w:sz w:val="20"/>
                 <w:szCs w:val="20"/>
               </w:rPr>
-              <w:t xml:space="preserve">Projected Revenue — Site &amp; Serviced Land Sales</w:t>
+              <w:t xml:space="preserve">Minimum Target ROI</w:t>
             </w:r>
           </w:p>
         </w:tc>
@@ -1076,7 +1139,7 @@
               <w:bottom w:val="single" w:color="CCCCCC" w:sz="2"/>
               <w:right w:val="single" w:color="CCCCCC" w:sz="2"/>
             </w:tcBorders>
-            <w:shd w:fill="FFFFFF" w:val="clear"/>
+            <w:shd w:fill="F7F7F7" w:val="clear"/>
             <w:tcMar>
               <w:top w:type="dxa" w:w="80"/>
               <w:left w:type="dxa" w:w="120"/>
@@ -1097,7 +1160,7 @@
                 <w:sz w:val="20"/>
                 <w:szCs w:val="20"/>
               </w:rPr>
-              <w:t xml:space="preserve">₦50 billion</w:t>
+              <w:t xml:space="preserve">20%</w:t>
             </w:r>
           </w:p>
         </w:tc>
@@ -1112,7 +1175,7 @@
               <w:bottom w:val="single" w:color="CCCCCC" w:sz="2"/>
               <w:right w:val="single" w:color="CCCCCC" w:sz="2"/>
             </w:tcBorders>
-            <w:shd w:fill="F7F7F7" w:val="clear"/>
+            <w:shd w:fill="FFFFFF" w:val="clear"/>
             <w:tcMar>
               <w:top w:type="dxa" w:w="80"/>
               <w:left w:type="dxa" w:w="120"/>
@@ -1133,7 +1196,7 @@
                 <w:sz w:val="20"/>
                 <w:szCs w:val="20"/>
               </w:rPr>
-              <w:t xml:space="preserve">Minimum Target ROI</w:t>
+              <w:t xml:space="preserve">Projected ROI (stated-cost basis)</w:t>
             </w:r>
           </w:p>
         </w:tc>
@@ -1146,42 +1209,6 @@
               <w:bottom w:val="single" w:color="CCCCCC" w:sz="2"/>
               <w:right w:val="single" w:color="CCCCCC" w:sz="2"/>
             </w:tcBorders>
-            <w:shd w:fill="F7F7F7" w:val="clear"/>
-            <w:tcMar>
-              <w:top w:type="dxa" w:w="80"/>
-              <w:left w:type="dxa" w:w="120"/>
-              <w:bottom w:type="dxa" w:w="80"/>
-              <w:right w:type="dxa" w:w="120"/>
-            </w:tcMar>
-            <w:vAlign w:val="center"/>
-          </w:tcPr>
-          <w:p>
-            <w:pPr>
-              <w:jc w:val="left"/>
-            </w:pPr>
-            <w:r>
-              <w:rPr>
-                <w:b w:val="false"/>
-                <w:bCs w:val="false"/>
-                <w:color w:val="0F2A3D"/>
-                <w:sz w:val="20"/>
-                <w:szCs w:val="20"/>
-              </w:rPr>
-              <w:t xml:space="preserve">20%</w:t>
-            </w:r>
-          </w:p>
-        </w:tc>
-      </w:tr>
-      <w:tr>
-        <w:tc>
-          <w:tcPr>
-            <w:tcW w:type="dxa" w:w="4680"/>
-            <w:tcBorders>
-              <w:top w:val="single" w:color="CCCCCC" w:sz="2"/>
-              <w:left w:val="single" w:color="CCCCCC" w:sz="2"/>
-              <w:bottom w:val="single" w:color="CCCCCC" w:sz="2"/>
-              <w:right w:val="single" w:color="CCCCCC" w:sz="2"/>
-            </w:tcBorders>
             <w:shd w:fill="FFFFFF" w:val="clear"/>
             <w:tcMar>
               <w:top w:type="dxa" w:w="80"/>
@@ -1192,52 +1219,8 @@
             <w:vAlign w:val="center"/>
           </w:tcPr>
           <w:p>
-            <w:pPr>
-              <w:jc w:val="left"/>
-            </w:pPr>
-            <w:r>
-              <w:rPr>
-                <w:b/>
-                <w:bCs/>
-                <w:color w:val="0F2A3D"/>
-                <w:sz w:val="20"/>
-                <w:szCs w:val="20"/>
-              </w:rPr>
-              <w:t xml:space="preserve">Projected ROI (stated-cost basis)</w:t>
-            </w:r>
-          </w:p>
-        </w:tc>
-        <w:tc>
-          <w:tcPr>
-            <w:tcW w:type="dxa" w:w="5400"/>
-            <w:tcBorders>
-              <w:top w:val="single" w:color="CCCCCC" w:sz="2"/>
-              <w:left w:val="single" w:color="CCCCCC" w:sz="2"/>
-              <w:bottom w:val="single" w:color="CCCCCC" w:sz="2"/>
-              <w:right w:val="single" w:color="CCCCCC" w:sz="2"/>
-            </w:tcBorders>
-            <w:shd w:fill="FFFFFF" w:val="clear"/>
-            <w:tcMar>
-              <w:top w:type="dxa" w:w="80"/>
-              <w:left w:type="dxa" w:w="120"/>
-              <w:bottom w:type="dxa" w:w="80"/>
-              <w:right w:type="dxa" w:w="120"/>
-            </w:tcMar>
-            <w:vAlign w:val="center"/>
-          </w:tcPr>
-          <w:p>
-            <w:pPr>
-              <w:jc w:val="left"/>
-            </w:pPr>
-            <w:r>
-              <w:rPr>
-                <w:b w:val="false"/>
-                <w:bCs w:val="false"/>
-                <w:color w:val="0F2A3D"/>
-                <w:sz w:val="20"/>
-                <w:szCs w:val="20"/>
-              </w:rPr>
-              <w:t xml:space="preserve">≈186%</w:t>
+            <w:r>
+              <w:t>≈128.6%</w:t>
             </w:r>
           </w:p>
         </w:tc>
@@ -1700,68 +1683,20 @@
         <w:tc>
           <w:tcPr>
             <w:tcW w:type="dxa" w:w="6480"/>
-            <w:tcBorders>
-              <w:top w:val="single" w:color="CCCCCC" w:sz="2"/>
-              <w:left w:val="single" w:color="CCCCCC" w:sz="2"/>
-              <w:bottom w:val="single" w:color="CCCCCC" w:sz="2"/>
-              <w:right w:val="single" w:color="CCCCCC" w:sz="2"/>
-            </w:tcBorders>
-            <w:shd w:fill="FFFFFF" w:val="clear"/>
-            <w:tcMar>
-              <w:top w:type="dxa" w:w="80"/>
-              <w:left w:type="dxa" w:w="120"/>
-              <w:bottom w:type="dxa" w:w="80"/>
-              <w:right w:type="dxa" w:w="120"/>
-            </w:tcMar>
-            <w:vAlign w:val="center"/>
-          </w:tcPr>
-          <w:p>
-            <w:pPr>
-              <w:jc w:val="left"/>
-            </w:pPr>
-            <w:r>
-              <w:rPr>
-                <w:b/>
-                <w:bCs/>
-                <w:color w:val="0F2A3D"/>
-                <w:sz w:val="20"/>
-                <w:szCs w:val="20"/>
-              </w:rPr>
-              <w:t xml:space="preserve">18-Hole Golf Course (Lakes, Fairways &amp; Greens)</w:t>
+          </w:tcPr>
+          <w:p>
+            <w:r>
+              <w:t>18-Hole Golf Course (Lakes, Fairways &amp; Greens)</w:t>
             </w:r>
           </w:p>
         </w:tc>
         <w:tc>
           <w:tcPr>
             <w:tcW w:type="dxa" w:w="3600"/>
-            <w:tcBorders>
-              <w:top w:val="single" w:color="CCCCCC" w:sz="2"/>
-              <w:left w:val="single" w:color="CCCCCC" w:sz="2"/>
-              <w:bottom w:val="single" w:color="CCCCCC" w:sz="2"/>
-              <w:right w:val="single" w:color="CCCCCC" w:sz="2"/>
-            </w:tcBorders>
-            <w:shd w:fill="FFFFFF" w:val="clear"/>
-            <w:tcMar>
-              <w:top w:type="dxa" w:w="80"/>
-              <w:left w:type="dxa" w:w="120"/>
-              <w:bottom w:type="dxa" w:w="80"/>
-              <w:right w:type="dxa" w:w="120"/>
-            </w:tcMar>
-            <w:vAlign w:val="center"/>
-          </w:tcPr>
-          <w:p>
-            <w:pPr>
-              <w:jc w:val="left"/>
-            </w:pPr>
-            <w:r>
-              <w:rPr>
-                <w:b w:val="false"/>
-                <w:bCs w:val="false"/>
-                <w:color w:val="0F2A3D"/>
-                <w:sz w:val="20"/>
-                <w:szCs w:val="20"/>
-              </w:rPr>
-              <w:t xml:space="preserve">27 ha</w:t>
+          </w:tcPr>
+          <w:p>
+            <w:r>
+              <w:t>27 ha</w:t>
             </w:r>
           </w:p>
         </w:tc>
@@ -1770,68 +1705,20 @@
         <w:tc>
           <w:tcPr>
             <w:tcW w:type="dxa" w:w="6480"/>
-            <w:tcBorders>
-              <w:top w:val="single" w:color="CCCCCC" w:sz="2"/>
-              <w:left w:val="single" w:color="CCCCCC" w:sz="2"/>
-              <w:bottom w:val="single" w:color="CCCCCC" w:sz="2"/>
-              <w:right w:val="single" w:color="CCCCCC" w:sz="2"/>
-            </w:tcBorders>
-            <w:shd w:fill="F7F7F7" w:val="clear"/>
-            <w:tcMar>
-              <w:top w:type="dxa" w:w="80"/>
-              <w:left w:type="dxa" w:w="120"/>
-              <w:bottom w:type="dxa" w:w="80"/>
-              <w:right w:type="dxa" w:w="120"/>
-            </w:tcMar>
-            <w:vAlign w:val="center"/>
-          </w:tcPr>
-          <w:p>
-            <w:pPr>
-              <w:jc w:val="left"/>
-            </w:pPr>
-            <w:r>
-              <w:rPr>
-                <w:b/>
-                <w:bCs/>
-                <w:color w:val="0F2A3D"/>
-                <w:sz w:val="20"/>
-                <w:szCs w:val="20"/>
-              </w:rPr>
-              <w:t xml:space="preserve">Golf Estate Residential (100 duplexes + serviced plots)</w:t>
+          </w:tcPr>
+          <w:p>
+            <w:r>
+              <w:t>Golf Estate Residential (100 duplexes + serviced plots)</w:t>
             </w:r>
           </w:p>
         </w:tc>
         <w:tc>
           <w:tcPr>
             <w:tcW w:type="dxa" w:w="3600"/>
-            <w:tcBorders>
-              <w:top w:val="single" w:color="CCCCCC" w:sz="2"/>
-              <w:left w:val="single" w:color="CCCCCC" w:sz="2"/>
-              <w:bottom w:val="single" w:color="CCCCCC" w:sz="2"/>
-              <w:right w:val="single" w:color="CCCCCC" w:sz="2"/>
-            </w:tcBorders>
-            <w:shd w:fill="F7F7F7" w:val="clear"/>
-            <w:tcMar>
-              <w:top w:type="dxa" w:w="80"/>
-              <w:left w:type="dxa" w:w="120"/>
-              <w:bottom w:type="dxa" w:w="80"/>
-              <w:right w:type="dxa" w:w="120"/>
-            </w:tcMar>
-            <w:vAlign w:val="center"/>
-          </w:tcPr>
-          <w:p>
-            <w:pPr>
-              <w:jc w:val="left"/>
-            </w:pPr>
-            <w:r>
-              <w:rPr>
-                <w:b w:val="false"/>
-                <w:bCs w:val="false"/>
-                <w:color w:val="0F2A3D"/>
-                <w:sz w:val="20"/>
-                <w:szCs w:val="20"/>
-              </w:rPr>
-              <w:t xml:space="preserve">22 ha</w:t>
+          </w:tcPr>
+          <w:p>
+            <w:r>
+              <w:t>11 ha</w:t>
             </w:r>
           </w:p>
         </w:tc>
@@ -1840,68 +1727,20 @@
         <w:tc>
           <w:tcPr>
             <w:tcW w:type="dxa" w:w="6480"/>
-            <w:tcBorders>
-              <w:top w:val="single" w:color="CCCCCC" w:sz="2"/>
-              <w:left w:val="single" w:color="CCCCCC" w:sz="2"/>
-              <w:bottom w:val="single" w:color="CCCCCC" w:sz="2"/>
-              <w:right w:val="single" w:color="CCCCCC" w:sz="2"/>
-            </w:tcBorders>
-            <w:shd w:fill="FFFFFF" w:val="clear"/>
-            <w:tcMar>
-              <w:top w:type="dxa" w:w="80"/>
-              <w:left w:type="dxa" w:w="120"/>
-              <w:bottom w:type="dxa" w:w="80"/>
-              <w:right w:type="dxa" w:w="120"/>
-            </w:tcMar>
-            <w:vAlign w:val="center"/>
-          </w:tcPr>
-          <w:p>
-            <w:pPr>
-              <w:jc w:val="left"/>
-            </w:pPr>
-            <w:r>
-              <w:rPr>
-                <w:b/>
-                <w:bCs/>
-                <w:color w:val="0F2A3D"/>
-                <w:sz w:val="20"/>
-                <w:szCs w:val="20"/>
-              </w:rPr>
-              <w:t xml:space="preserve">Clubhouse, Sports &amp; Golf Academy</w:t>
+          </w:tcPr>
+          <w:p>
+            <w:r>
+              <w:t>Clubhouse, Sports &amp; Golf Academy</w:t>
             </w:r>
           </w:p>
         </w:tc>
         <w:tc>
           <w:tcPr>
             <w:tcW w:type="dxa" w:w="3600"/>
-            <w:tcBorders>
-              <w:top w:val="single" w:color="CCCCCC" w:sz="2"/>
-              <w:left w:val="single" w:color="CCCCCC" w:sz="2"/>
-              <w:bottom w:val="single" w:color="CCCCCC" w:sz="2"/>
-              <w:right w:val="single" w:color="CCCCCC" w:sz="2"/>
-            </w:tcBorders>
-            <w:shd w:fill="FFFFFF" w:val="clear"/>
-            <w:tcMar>
-              <w:top w:type="dxa" w:w="80"/>
-              <w:left w:type="dxa" w:w="120"/>
-              <w:bottom w:type="dxa" w:w="80"/>
-              <w:right w:type="dxa" w:w="120"/>
-            </w:tcMar>
-            <w:vAlign w:val="center"/>
-          </w:tcPr>
-          <w:p>
-            <w:pPr>
-              <w:jc w:val="left"/>
-            </w:pPr>
-            <w:r>
-              <w:rPr>
-                <w:b w:val="false"/>
-                <w:bCs w:val="false"/>
-                <w:color w:val="0F2A3D"/>
-                <w:sz w:val="20"/>
-                <w:szCs w:val="20"/>
-              </w:rPr>
-              <w:t xml:space="preserve">6 ha</w:t>
+          </w:tcPr>
+          <w:p>
+            <w:r>
+              <w:t>6 ha</w:t>
             </w:r>
           </w:p>
         </w:tc>
@@ -1910,68 +1749,20 @@
         <w:tc>
           <w:tcPr>
             <w:tcW w:type="dxa" w:w="6480"/>
-            <w:tcBorders>
-              <w:top w:val="single" w:color="CCCCCC" w:sz="2"/>
-              <w:left w:val="single" w:color="CCCCCC" w:sz="2"/>
-              <w:bottom w:val="single" w:color="CCCCCC" w:sz="2"/>
-              <w:right w:val="single" w:color="CCCCCC" w:sz="2"/>
-            </w:tcBorders>
-            <w:shd w:fill="F7F7F7" w:val="clear"/>
-            <w:tcMar>
-              <w:top w:type="dxa" w:w="80"/>
-              <w:left w:type="dxa" w:w="120"/>
-              <w:bottom w:type="dxa" w:w="80"/>
-              <w:right w:type="dxa" w:w="120"/>
-            </w:tcMar>
-            <w:vAlign w:val="center"/>
-          </w:tcPr>
-          <w:p>
-            <w:pPr>
-              <w:jc w:val="left"/>
-            </w:pPr>
-            <w:r>
-              <w:rPr>
-                <w:b/>
-                <w:bCs/>
-                <w:color w:val="0F2A3D"/>
-                <w:sz w:val="20"/>
-                <w:szCs w:val="20"/>
-              </w:rPr>
-              <w:t xml:space="preserve">Hotel &amp; Resort</w:t>
+          </w:tcPr>
+          <w:p>
+            <w:r>
+              <w:t>Hotel &amp; Resort</w:t>
             </w:r>
           </w:p>
         </w:tc>
         <w:tc>
           <w:tcPr>
             <w:tcW w:type="dxa" w:w="3600"/>
-            <w:tcBorders>
-              <w:top w:val="single" w:color="CCCCCC" w:sz="2"/>
-              <w:left w:val="single" w:color="CCCCCC" w:sz="2"/>
-              <w:bottom w:val="single" w:color="CCCCCC" w:sz="2"/>
-              <w:right w:val="single" w:color="CCCCCC" w:sz="2"/>
-            </w:tcBorders>
-            <w:shd w:fill="F7F7F7" w:val="clear"/>
-            <w:tcMar>
-              <w:top w:type="dxa" w:w="80"/>
-              <w:left w:type="dxa" w:w="120"/>
-              <w:bottom w:type="dxa" w:w="80"/>
-              <w:right w:type="dxa" w:w="120"/>
-            </w:tcMar>
-            <w:vAlign w:val="center"/>
-          </w:tcPr>
-          <w:p>
-            <w:pPr>
-              <w:jc w:val="left"/>
-            </w:pPr>
-            <w:r>
-              <w:rPr>
-                <w:b w:val="false"/>
-                <w:bCs w:val="false"/>
-                <w:color w:val="0F2A3D"/>
-                <w:sz w:val="20"/>
-                <w:szCs w:val="20"/>
-              </w:rPr>
-              <w:t xml:space="preserve">4 ha</w:t>
+          </w:tcPr>
+          <w:p>
+            <w:r>
+              <w:t>4 ha</w:t>
             </w:r>
           </w:p>
         </w:tc>
@@ -1980,68 +1771,20 @@
         <w:tc>
           <w:tcPr>
             <w:tcW w:type="dxa" w:w="6480"/>
-            <w:tcBorders>
-              <w:top w:val="single" w:color="CCCCCC" w:sz="2"/>
-              <w:left w:val="single" w:color="CCCCCC" w:sz="2"/>
-              <w:bottom w:val="single" w:color="CCCCCC" w:sz="2"/>
-              <w:right w:val="single" w:color="CCCCCC" w:sz="2"/>
-            </w:tcBorders>
-            <w:shd w:fill="FFFFFF" w:val="clear"/>
-            <w:tcMar>
-              <w:top w:type="dxa" w:w="80"/>
-              <w:left w:type="dxa" w:w="120"/>
-              <w:bottom w:type="dxa" w:w="80"/>
-              <w:right w:type="dxa" w:w="120"/>
-            </w:tcMar>
-            <w:vAlign w:val="center"/>
-          </w:tcPr>
-          <w:p>
-            <w:pPr>
-              <w:jc w:val="left"/>
-            </w:pPr>
-            <w:r>
-              <w:rPr>
-                <w:b/>
-                <w:bCs/>
-                <w:color w:val="0F2A3D"/>
-                <w:sz w:val="20"/>
-                <w:szCs w:val="20"/>
-              </w:rPr>
-              <w:t xml:space="preserve">Shopping &amp; Lifestyle Village</w:t>
+          </w:tcPr>
+          <w:p>
+            <w:r>
+              <w:t>Shopping &amp; Lifestyle Village</w:t>
             </w:r>
           </w:p>
         </w:tc>
         <w:tc>
           <w:tcPr>
             <w:tcW w:type="dxa" w:w="3600"/>
-            <w:tcBorders>
-              <w:top w:val="single" w:color="CCCCCC" w:sz="2"/>
-              <w:left w:val="single" w:color="CCCCCC" w:sz="2"/>
-              <w:bottom w:val="single" w:color="CCCCCC" w:sz="2"/>
-              <w:right w:val="single" w:color="CCCCCC" w:sz="2"/>
-            </w:tcBorders>
-            <w:shd w:fill="FFFFFF" w:val="clear"/>
-            <w:tcMar>
-              <w:top w:type="dxa" w:w="80"/>
-              <w:left w:type="dxa" w:w="120"/>
-              <w:bottom w:type="dxa" w:w="80"/>
-              <w:right w:type="dxa" w:w="120"/>
-            </w:tcMar>
-            <w:vAlign w:val="center"/>
-          </w:tcPr>
-          <w:p>
-            <w:pPr>
-              <w:jc w:val="left"/>
-            </w:pPr>
-            <w:r>
-              <w:rPr>
-                <w:b w:val="false"/>
-                <w:bCs w:val="false"/>
-                <w:color w:val="0F2A3D"/>
-                <w:sz w:val="20"/>
-                <w:szCs w:val="20"/>
-              </w:rPr>
-              <w:t xml:space="preserve">4 ha</w:t>
+          </w:tcPr>
+          <w:p>
+            <w:r>
+              <w:t>4 ha</w:t>
             </w:r>
           </w:p>
         </w:tc>
@@ -2050,68 +1793,20 @@
         <w:tc>
           <w:tcPr>
             <w:tcW w:type="dxa" w:w="6480"/>
-            <w:tcBorders>
-              <w:top w:val="single" w:color="CCCCCC" w:sz="2"/>
-              <w:left w:val="single" w:color="CCCCCC" w:sz="2"/>
-              <w:bottom w:val="single" w:color="CCCCCC" w:sz="2"/>
-              <w:right w:val="single" w:color="CCCCCC" w:sz="2"/>
-            </w:tcBorders>
-            <w:shd w:fill="F7F7F7" w:val="clear"/>
-            <w:tcMar>
-              <w:top w:type="dxa" w:w="80"/>
-              <w:left w:type="dxa" w:w="120"/>
-              <w:bottom w:type="dxa" w:w="80"/>
-              <w:right w:type="dxa" w:w="120"/>
-            </w:tcMar>
-            <w:vAlign w:val="center"/>
-          </w:tcPr>
-          <w:p>
-            <w:pPr>
-              <w:jc w:val="left"/>
-            </w:pPr>
-            <w:r>
-              <w:rPr>
-                <w:b/>
-                <w:bCs/>
-                <w:color w:val="0F2A3D"/>
-                <w:sz w:val="20"/>
-                <w:szCs w:val="20"/>
-              </w:rPr>
-              <w:t xml:space="preserve">Hospital &amp; Wellness</w:t>
+          </w:tcPr>
+          <w:p>
+            <w:r>
+              <w:t>Hospital &amp; Wellness</w:t>
             </w:r>
           </w:p>
         </w:tc>
         <w:tc>
           <w:tcPr>
             <w:tcW w:type="dxa" w:w="3600"/>
-            <w:tcBorders>
-              <w:top w:val="single" w:color="CCCCCC" w:sz="2"/>
-              <w:left w:val="single" w:color="CCCCCC" w:sz="2"/>
-              <w:bottom w:val="single" w:color="CCCCCC" w:sz="2"/>
-              <w:right w:val="single" w:color="CCCCCC" w:sz="2"/>
-            </w:tcBorders>
-            <w:shd w:fill="F7F7F7" w:val="clear"/>
-            <w:tcMar>
-              <w:top w:type="dxa" w:w="80"/>
-              <w:left w:type="dxa" w:w="120"/>
-              <w:bottom w:type="dxa" w:w="80"/>
-              <w:right w:type="dxa" w:w="120"/>
-            </w:tcMar>
-            <w:vAlign w:val="center"/>
-          </w:tcPr>
-          <w:p>
-            <w:pPr>
-              <w:jc w:val="left"/>
-            </w:pPr>
-            <w:r>
-              <w:rPr>
-                <w:b w:val="false"/>
-                <w:bCs w:val="false"/>
-                <w:color w:val="0F2A3D"/>
-                <w:sz w:val="20"/>
-                <w:szCs w:val="20"/>
-              </w:rPr>
-              <w:t xml:space="preserve">3 ha</w:t>
+          </w:tcPr>
+          <w:p>
+            <w:r>
+              <w:t>3 ha</w:t>
             </w:r>
           </w:p>
         </w:tc>
@@ -2120,68 +1815,20 @@
         <w:tc>
           <w:tcPr>
             <w:tcW w:type="dxa" w:w="6480"/>
-            <w:tcBorders>
-              <w:top w:val="single" w:color="CCCCCC" w:sz="2"/>
-              <w:left w:val="single" w:color="CCCCCC" w:sz="2"/>
-              <w:bottom w:val="single" w:color="CCCCCC" w:sz="2"/>
-              <w:right w:val="single" w:color="CCCCCC" w:sz="2"/>
-            </w:tcBorders>
-            <w:shd w:fill="FFFFFF" w:val="clear"/>
-            <w:tcMar>
-              <w:top w:type="dxa" w:w="80"/>
-              <w:left w:type="dxa" w:w="120"/>
-              <w:bottom w:type="dxa" w:w="80"/>
-              <w:right w:type="dxa" w:w="120"/>
-            </w:tcMar>
-            <w:vAlign w:val="center"/>
-          </w:tcPr>
-          <w:p>
-            <w:pPr>
-              <w:jc w:val="left"/>
-            </w:pPr>
-            <w:r>
-              <w:rPr>
-                <w:b/>
-                <w:bCs/>
-                <w:color w:val="0F2A3D"/>
-                <w:sz w:val="20"/>
-                <w:szCs w:val="20"/>
-              </w:rPr>
-              <w:t xml:space="preserve">International School</w:t>
+          </w:tcPr>
+          <w:p>
+            <w:r>
+              <w:t>International School</w:t>
             </w:r>
           </w:p>
         </w:tc>
         <w:tc>
           <w:tcPr>
             <w:tcW w:type="dxa" w:w="3600"/>
-            <w:tcBorders>
-              <w:top w:val="single" w:color="CCCCCC" w:sz="2"/>
-              <w:left w:val="single" w:color="CCCCCC" w:sz="2"/>
-              <w:bottom w:val="single" w:color="CCCCCC" w:sz="2"/>
-              <w:right w:val="single" w:color="CCCCCC" w:sz="2"/>
-            </w:tcBorders>
-            <w:shd w:fill="FFFFFF" w:val="clear"/>
-            <w:tcMar>
-              <w:top w:type="dxa" w:w="80"/>
-              <w:left w:type="dxa" w:w="120"/>
-              <w:bottom w:type="dxa" w:w="80"/>
-              <w:right w:type="dxa" w:w="120"/>
-            </w:tcMar>
-            <w:vAlign w:val="center"/>
-          </w:tcPr>
-          <w:p>
-            <w:pPr>
-              <w:jc w:val="left"/>
-            </w:pPr>
-            <w:r>
-              <w:rPr>
-                <w:b w:val="false"/>
-                <w:bCs w:val="false"/>
-                <w:color w:val="0F2A3D"/>
-                <w:sz w:val="20"/>
-                <w:szCs w:val="20"/>
-              </w:rPr>
-              <w:t xml:space="preserve">3 ha</w:t>
+          </w:tcPr>
+          <w:p>
+            <w:r>
+              <w:t>3 ha</w:t>
             </w:r>
           </w:p>
         </w:tc>
@@ -2190,68 +1837,20 @@
         <w:tc>
           <w:tcPr>
             <w:tcW w:type="dxa" w:w="6480"/>
-            <w:tcBorders>
-              <w:top w:val="single" w:color="CCCCCC" w:sz="2"/>
-              <w:left w:val="single" w:color="CCCCCC" w:sz="2"/>
-              <w:bottom w:val="single" w:color="CCCCCC" w:sz="2"/>
-              <w:right w:val="single" w:color="CCCCCC" w:sz="2"/>
-            </w:tcBorders>
-            <w:shd w:fill="F7F7F7" w:val="clear"/>
-            <w:tcMar>
-              <w:top w:type="dxa" w:w="80"/>
-              <w:left w:type="dxa" w:w="120"/>
-              <w:bottom w:type="dxa" w:w="80"/>
-              <w:right w:type="dxa" w:w="120"/>
-            </w:tcMar>
-            <w:vAlign w:val="center"/>
-          </w:tcPr>
-          <w:p>
-            <w:pPr>
-              <w:jc w:val="left"/>
-            </w:pPr>
-            <w:r>
-              <w:rPr>
-                <w:b/>
-                <w:bCs/>
-                <w:color w:val="0F2A3D"/>
-                <w:sz w:val="20"/>
-                <w:szCs w:val="20"/>
-              </w:rPr>
-              <w:t xml:space="preserve">Main Gate, Security &amp; Services</w:t>
+          </w:tcPr>
+          <w:p>
+            <w:r>
+              <w:t>Statutory Infrastructure Reserve (FCDA min. 25% — roads, drainage, utilities, main gate, security &amp; public open space)</w:t>
             </w:r>
           </w:p>
         </w:tc>
         <w:tc>
           <w:tcPr>
             <w:tcW w:type="dxa" w:w="3600"/>
-            <w:tcBorders>
-              <w:top w:val="single" w:color="CCCCCC" w:sz="2"/>
-              <w:left w:val="single" w:color="CCCCCC" w:sz="2"/>
-              <w:bottom w:val="single" w:color="CCCCCC" w:sz="2"/>
-              <w:right w:val="single" w:color="CCCCCC" w:sz="2"/>
-            </w:tcBorders>
-            <w:shd w:fill="F7F7F7" w:val="clear"/>
-            <w:tcMar>
-              <w:top w:type="dxa" w:w="80"/>
-              <w:left w:type="dxa" w:w="120"/>
-              <w:bottom w:type="dxa" w:w="80"/>
-              <w:right w:type="dxa" w:w="120"/>
-            </w:tcMar>
-            <w:vAlign w:val="center"/>
-          </w:tcPr>
-          <w:p>
-            <w:pPr>
-              <w:jc w:val="left"/>
-            </w:pPr>
-            <w:r>
-              <w:rPr>
-                <w:b w:val="false"/>
-                <w:bCs w:val="false"/>
-                <w:color w:val="0F2A3D"/>
-                <w:sz w:val="20"/>
-                <w:szCs w:val="20"/>
-              </w:rPr>
-              <w:t xml:space="preserve">2 ha</w:t>
+          </w:tcPr>
+          <w:p>
+            <w:r>
+              <w:t>19 ha</w:t>
             </w:r>
           </w:p>
         </w:tc>
@@ -2260,138 +1859,20 @@
         <w:tc>
           <w:tcPr>
             <w:tcW w:type="dxa" w:w="6480"/>
-            <w:tcBorders>
-              <w:top w:val="single" w:color="CCCCCC" w:sz="2"/>
-              <w:left w:val="single" w:color="CCCCCC" w:sz="2"/>
-              <w:bottom w:val="single" w:color="CCCCCC" w:sz="2"/>
-              <w:right w:val="single" w:color="CCCCCC" w:sz="2"/>
-            </w:tcBorders>
-            <w:shd w:fill="FFFFFF" w:val="clear"/>
-            <w:tcMar>
-              <w:top w:type="dxa" w:w="80"/>
-              <w:left w:type="dxa" w:w="120"/>
-              <w:bottom w:type="dxa" w:w="80"/>
-              <w:right w:type="dxa" w:w="120"/>
-            </w:tcMar>
-            <w:vAlign w:val="center"/>
-          </w:tcPr>
-          <w:p>
-            <w:pPr>
-              <w:jc w:val="left"/>
-            </w:pPr>
-            <w:r>
-              <w:rPr>
-                <w:b/>
-                <w:bCs/>
-                <w:color w:val="0F2A3D"/>
-                <w:sz w:val="20"/>
-                <w:szCs w:val="20"/>
-              </w:rPr>
-              <w:t xml:space="preserve">Roads &amp; Green Buffer</w:t>
+          </w:tcPr>
+          <w:p>
+            <w:r>
+              <w:t>Total</w:t>
             </w:r>
           </w:p>
         </w:tc>
         <w:tc>
           <w:tcPr>
             <w:tcW w:type="dxa" w:w="3600"/>
-            <w:tcBorders>
-              <w:top w:val="single" w:color="CCCCCC" w:sz="2"/>
-              <w:left w:val="single" w:color="CCCCCC" w:sz="2"/>
-              <w:bottom w:val="single" w:color="CCCCCC" w:sz="2"/>
-              <w:right w:val="single" w:color="CCCCCC" w:sz="2"/>
-            </w:tcBorders>
-            <w:shd w:fill="FFFFFF" w:val="clear"/>
-            <w:tcMar>
-              <w:top w:type="dxa" w:w="80"/>
-              <w:left w:type="dxa" w:w="120"/>
-              <w:bottom w:type="dxa" w:w="80"/>
-              <w:right w:type="dxa" w:w="120"/>
-            </w:tcMar>
-            <w:vAlign w:val="center"/>
-          </w:tcPr>
-          <w:p>
-            <w:pPr>
-              <w:jc w:val="left"/>
-            </w:pPr>
-            <w:r>
-              <w:rPr>
-                <w:b w:val="false"/>
-                <w:bCs w:val="false"/>
-                <w:color w:val="0F2A3D"/>
-                <w:sz w:val="20"/>
-                <w:szCs w:val="20"/>
-              </w:rPr>
-              <w:t xml:space="preserve">6 ha</w:t>
-            </w:r>
-          </w:p>
-        </w:tc>
-      </w:tr>
-      <w:tr>
-        <w:tc>
-          <w:tcPr>
-            <w:tcW w:type="dxa" w:w="6480"/>
-            <w:tcBorders>
-              <w:top w:val="single" w:color="CCCCCC" w:sz="2"/>
-              <w:left w:val="single" w:color="CCCCCC" w:sz="2"/>
-              <w:bottom w:val="single" w:color="CCCCCC" w:sz="2"/>
-              <w:right w:val="single" w:color="CCCCCC" w:sz="2"/>
-            </w:tcBorders>
-            <w:shd w:fill="F7F7F7" w:val="clear"/>
-            <w:tcMar>
-              <w:top w:type="dxa" w:w="80"/>
-              <w:left w:type="dxa" w:w="120"/>
-              <w:bottom w:type="dxa" w:w="80"/>
-              <w:right w:type="dxa" w:w="120"/>
-            </w:tcMar>
-            <w:vAlign w:val="center"/>
-          </w:tcPr>
-          <w:p>
-            <w:pPr>
-              <w:jc w:val="left"/>
-            </w:pPr>
-            <w:r>
-              <w:rPr>
-                <w:b/>
-                <w:bCs/>
-                <w:color w:val="0F2A3D"/>
-                <w:sz w:val="20"/>
-                <w:szCs w:val="20"/>
-              </w:rPr>
-              <w:t xml:space="preserve">Total</w:t>
-            </w:r>
-          </w:p>
-        </w:tc>
-        <w:tc>
-          <w:tcPr>
-            <w:tcW w:type="dxa" w:w="3600"/>
-            <w:tcBorders>
-              <w:top w:val="single" w:color="CCCCCC" w:sz="2"/>
-              <w:left w:val="single" w:color="CCCCCC" w:sz="2"/>
-              <w:bottom w:val="single" w:color="CCCCCC" w:sz="2"/>
-              <w:right w:val="single" w:color="CCCCCC" w:sz="2"/>
-            </w:tcBorders>
-            <w:shd w:fill="F7F7F7" w:val="clear"/>
-            <w:tcMar>
-              <w:top w:type="dxa" w:w="80"/>
-              <w:left w:type="dxa" w:w="120"/>
-              <w:bottom w:type="dxa" w:w="80"/>
-              <w:right w:type="dxa" w:w="120"/>
-            </w:tcMar>
-            <w:vAlign w:val="center"/>
-          </w:tcPr>
-          <w:p>
-            <w:pPr>
-              <w:jc w:val="left"/>
-            </w:pPr>
-            <w:r>
-              <w:rPr>
-                <w:b w:val="false"/>
-                <w:bCs w:val="false"/>
-                <w:color w:val="0F2A3D"/>
-                <w:sz w:val="20"/>
-                <w:szCs w:val="20"/>
-              </w:rPr>
-              <w:t xml:space="preserve">77 ha</w:t>
+          </w:tcPr>
+          <w:p>
+            <w:r>
+              <w:t>77 ha</w:t>
             </w:r>
           </w:p>
         </w:tc>
@@ -2410,7 +1891,7 @@
           <w:sz w:val="18"/>
           <w:szCs w:val="18"/>
         </w:rPr>
-        <w:t xml:space="preserve">Note: the golf course, golf estate residential zone, hotel and shopping village figures match Tom's independently produced conceptual spatial layout exactly (27 ha / 22 ha / 4 ha / 4 ha). The clubhouse &amp; sports, hospital, international school, gatehouse/security and roads figures are reasonable planning allocations for the remaining land and should be confirmed once the topographical survey and architectural masterplan are completed.</w:t>
+        <w:t>Note: the golf course, hotel and shopping village figures match Tom's independently produced conceptual spatial layout exactly (27 ha / 4 ha / 4 ha). The golf estate residential zone is corrected from Tom's original 22 ha to 11 ha to make room for a proper 19-hectare Statutory Infrastructure Reserve (25% of the 77-hectare site), which the FCDA requires as a condition of layout approval and which the original layout under-allocated (only 8 ha was set aside for roads and gatehouse/security). The clubhouse &amp; sports, hospital and international school figures are reasonable planning allocations for the remaining land and should be confirmed once the topographical survey and architectural masterplan are completed.</w:t>
       </w:r>
     </w:p>
     <w:p>
@@ -2460,7 +1941,7 @@
         <w:jc w:val="both"/>
       </w:pPr>
       <w:r>
-        <w:t xml:space="preserve">The 22-hectare Golf Estate Residential zone houses the Phase 1 duplex product together with additional site-and-serviced plots released for direct sale (Section 12). Phase 1 residential product itself is 100 units of 4-bedroom luxury duplexes, each on a 500 sqm plot, including:</w:t>
+        <w:t>The Golf Estate Residential zone was originally conceived at 22 hectares, but is corrected in this version to 11 hectares once the FCDA's mandatory statutory infrastructure reserve (a minimum 25% of the full 77-hectare site — roads, drainage, utilities, public open space — Section 3) is properly accounted for. This 11-hectare zone houses the Phase 1 duplex product together with additional site-and-serviced plots released for direct sale (Section 12). Phase 1 residential product itself is 100 units of 4-bedroom luxury duplexes, each on a 500 sqm plot, including:</w:t>
       </w:r>
     </w:p>
     <w:p>
@@ -3040,7 +2521,7 @@
         <w:jc w:val="both"/>
       </w:pPr>
       <w:r>
-        <w:t xml:space="preserve">This dual-track approach lets the project raise capital broadly across retail buyers (plots/duplexes) and larger investors (Phase 2/3 income assets) without relying on any single investor class to reach the ₦50 billion Phase 1 revenue target in Section 9.</w:t>
+        <w:t>This dual-track approach lets the project raise capital broadly across retail buyers (plots/duplexes) and larger investors (Phase 2/3 income assets) without relying on any single investor class to reach the ₦40 billion Phase 1 revenue target in Section 9.</w:t>
       </w:r>
     </w:p>
     <w:p>
@@ -3792,18 +3273,8 @@
             <w:vAlign w:val="center"/>
           </w:tcPr>
           <w:p>
-            <w:pPr>
-              <w:jc w:val="left"/>
-            </w:pPr>
-            <w:r>
-              <w:rPr>
-                <w:b w:val="false"/>
-                <w:bCs w:val="false"/>
-                <w:color w:val="0F2A3D"/>
-                <w:sz w:val="20"/>
-                <w:szCs w:val="20"/>
-              </w:rPr>
-              <w:t xml:space="preserve">up to ₦24.17 billion</w:t>
+            <w:r>
+              <w:t>up to ₦15.83 billion</w:t>
             </w:r>
           </w:p>
         </w:tc>
@@ -3862,18 +3333,8 @@
             <w:vAlign w:val="center"/>
           </w:tcPr>
           <w:p>
-            <w:pPr>
-              <w:jc w:val="left"/>
-            </w:pPr>
-            <w:r>
-              <w:rPr>
-                <w:b w:val="false"/>
-                <w:bCs w:val="false"/>
-                <w:color w:val="0F2A3D"/>
-                <w:sz w:val="20"/>
-                <w:szCs w:val="20"/>
-              </w:rPr>
-              <w:t xml:space="preserve">₦41.67 billion</w:t>
+            <w:r>
+              <w:t>₦33.33 billion</w:t>
             </w:r>
           </w:p>
         </w:tc>
@@ -3978,68 +3439,20 @@
         <w:tc>
           <w:tcPr>
             <w:tcW w:type="dxa" w:w="6480"/>
-            <w:tcBorders>
-              <w:top w:val="single" w:color="CCCCCC" w:sz="2"/>
-              <w:left w:val="single" w:color="CCCCCC" w:sz="2"/>
-              <w:bottom w:val="single" w:color="CCCCCC" w:sz="2"/>
-              <w:right w:val="single" w:color="CCCCCC" w:sz="2"/>
-            </w:tcBorders>
-            <w:shd w:fill="FFFFFF" w:val="clear"/>
-            <w:tcMar>
-              <w:top w:type="dxa" w:w="80"/>
-              <w:left w:type="dxa" w:w="120"/>
-              <w:bottom w:type="dxa" w:w="80"/>
-              <w:right w:type="dxa" w:w="120"/>
-            </w:tcMar>
-            <w:vAlign w:val="center"/>
-          </w:tcPr>
-          <w:p>
-            <w:pPr>
-              <w:jc w:val="left"/>
-            </w:pPr>
-            <w:r>
-              <w:rPr>
-                <w:b/>
-                <w:bCs/>
-                <w:color w:val="0F2A3D"/>
-                <w:sz w:val="20"/>
-                <w:szCs w:val="20"/>
-              </w:rPr>
-              <w:t xml:space="preserve">Site &amp; Serviced Land Sales (Phase 1)</w:t>
+          </w:tcPr>
+          <w:p>
+            <w:r>
+              <w:t>Site &amp; Serviced Land Sales — 120 plots × ₦100M (Phase 1, corrected for FCDA-compliant 11 ha residential zone)</w:t>
             </w:r>
           </w:p>
         </w:tc>
         <w:tc>
           <w:tcPr>
             <w:tcW w:type="dxa" w:w="3600"/>
-            <w:tcBorders>
-              <w:top w:val="single" w:color="CCCCCC" w:sz="2"/>
-              <w:left w:val="single" w:color="CCCCCC" w:sz="2"/>
-              <w:bottom w:val="single" w:color="CCCCCC" w:sz="2"/>
-              <w:right w:val="single" w:color="CCCCCC" w:sz="2"/>
-            </w:tcBorders>
-            <w:shd w:fill="FFFFFF" w:val="clear"/>
-            <w:tcMar>
-              <w:top w:type="dxa" w:w="80"/>
-              <w:left w:type="dxa" w:w="120"/>
-              <w:bottom w:type="dxa" w:w="80"/>
-              <w:right w:type="dxa" w:w="120"/>
-            </w:tcMar>
-            <w:vAlign w:val="center"/>
-          </w:tcPr>
-          <w:p>
-            <w:pPr>
-              <w:jc w:val="left"/>
-            </w:pPr>
-            <w:r>
-              <w:rPr>
-                <w:b w:val="false"/>
-                <w:bCs w:val="false"/>
-                <w:color w:val="0F2A3D"/>
-                <w:sz w:val="20"/>
-                <w:szCs w:val="20"/>
-              </w:rPr>
-              <w:t xml:space="preserve">₦50 billion</w:t>
+          </w:tcPr>
+          <w:p>
+            <w:r>
+              <w:t>₦12 billion</w:t>
             </w:r>
           </w:p>
         </w:tc>
@@ -4048,68 +3461,20 @@
         <w:tc>
           <w:tcPr>
             <w:tcW w:type="dxa" w:w="6480"/>
-            <w:tcBorders>
-              <w:top w:val="single" w:color="CCCCCC" w:sz="2"/>
-              <w:left w:val="single" w:color="CCCCCC" w:sz="2"/>
-              <w:bottom w:val="single" w:color="CCCCCC" w:sz="2"/>
-              <w:right w:val="single" w:color="CCCCCC" w:sz="2"/>
-            </w:tcBorders>
-            <w:shd w:fill="F7F7F7" w:val="clear"/>
-            <w:tcMar>
-              <w:top w:type="dxa" w:w="80"/>
-              <w:left w:type="dxa" w:w="120"/>
-              <w:bottom w:type="dxa" w:w="80"/>
-              <w:right w:type="dxa" w:w="120"/>
-            </w:tcMar>
-            <w:vAlign w:val="center"/>
-          </w:tcPr>
-          <w:p>
-            <w:pPr>
-              <w:jc w:val="left"/>
-            </w:pPr>
-            <w:r>
-              <w:rPr>
-                <w:b/>
-                <w:bCs/>
-                <w:color w:val="0F2A3D"/>
-                <w:sz w:val="20"/>
-                <w:szCs w:val="20"/>
-              </w:rPr>
-              <w:t xml:space="preserve">Duplex Unit Sales (100 units)*</w:t>
+          </w:tcPr>
+          <w:p>
+            <w:r>
+              <w:t>Duplex Unit Sales — 100 units × ₦280M illustrative* (now included in base case, see note below)</w:t>
             </w:r>
           </w:p>
         </w:tc>
         <w:tc>
           <w:tcPr>
             <w:tcW w:type="dxa" w:w="3600"/>
-            <w:tcBorders>
-              <w:top w:val="single" w:color="CCCCCC" w:sz="2"/>
-              <w:left w:val="single" w:color="CCCCCC" w:sz="2"/>
-              <w:bottom w:val="single" w:color="CCCCCC" w:sz="2"/>
-              <w:right w:val="single" w:color="CCCCCC" w:sz="2"/>
-            </w:tcBorders>
-            <w:shd w:fill="F7F7F7" w:val="clear"/>
-            <w:tcMar>
-              <w:top w:type="dxa" w:w="80"/>
-              <w:left w:type="dxa" w:w="120"/>
-              <w:bottom w:type="dxa" w:w="80"/>
-              <w:right w:type="dxa" w:w="120"/>
-            </w:tcMar>
-            <w:vAlign w:val="center"/>
-          </w:tcPr>
-          <w:p>
-            <w:pPr>
-              <w:jc w:val="left"/>
-            </w:pPr>
-            <w:r>
-              <w:rPr>
-                <w:b w:val="false"/>
-                <w:bCs w:val="false"/>
-                <w:color w:val="0F2A3D"/>
-                <w:sz w:val="20"/>
-                <w:szCs w:val="20"/>
-              </w:rPr>
-              <w:t xml:space="preserve">Additional upside — not included in base case</w:t>
+          </w:tcPr>
+          <w:p>
+            <w:r>
+              <w:t>₦28 billion</w:t>
             </w:r>
           </w:p>
         </w:tc>
@@ -4118,68 +3483,20 @@
         <w:tc>
           <w:tcPr>
             <w:tcW w:type="dxa" w:w="6480"/>
-            <w:tcBorders>
-              <w:top w:val="single" w:color="CCCCCC" w:sz="2"/>
-              <w:left w:val="single" w:color="CCCCCC" w:sz="2"/>
-              <w:bottom w:val="single" w:color="CCCCCC" w:sz="2"/>
-              <w:right w:val="single" w:color="CCCCCC" w:sz="2"/>
-            </w:tcBorders>
-            <w:shd w:fill="FFFFFF" w:val="clear"/>
-            <w:tcMar>
-              <w:top w:type="dxa" w:w="80"/>
-              <w:left w:type="dxa" w:w="120"/>
-              <w:bottom w:type="dxa" w:w="80"/>
-              <w:right w:type="dxa" w:w="120"/>
-            </w:tcMar>
-            <w:vAlign w:val="center"/>
-          </w:tcPr>
-          <w:p>
-            <w:pPr>
-              <w:jc w:val="left"/>
-            </w:pPr>
-            <w:r>
-              <w:rPr>
-                <w:b/>
-                <w:bCs/>
-                <w:color w:val="0F2A3D"/>
-                <w:sz w:val="20"/>
-                <w:szCs w:val="20"/>
-              </w:rPr>
-              <w:t xml:space="preserve">Phase 2 Hotel &amp; Shopping Village Income*</w:t>
+          </w:tcPr>
+          <w:p>
+            <w:r>
+              <w:t>Total Phase 1 Base-Case Revenue</w:t>
             </w:r>
           </w:p>
         </w:tc>
         <w:tc>
           <w:tcPr>
             <w:tcW w:type="dxa" w:w="3600"/>
-            <w:tcBorders>
-              <w:top w:val="single" w:color="CCCCCC" w:sz="2"/>
-              <w:left w:val="single" w:color="CCCCCC" w:sz="2"/>
-              <w:bottom w:val="single" w:color="CCCCCC" w:sz="2"/>
-              <w:right w:val="single" w:color="CCCCCC" w:sz="2"/>
-            </w:tcBorders>
-            <w:shd w:fill="FFFFFF" w:val="clear"/>
-            <w:tcMar>
-              <w:top w:type="dxa" w:w="80"/>
-              <w:left w:type="dxa" w:w="120"/>
-              <w:bottom w:type="dxa" w:w="80"/>
-              <w:right w:type="dxa" w:w="120"/>
-            </w:tcMar>
-            <w:vAlign w:val="center"/>
-          </w:tcPr>
-          <w:p>
-            <w:pPr>
-              <w:jc w:val="left"/>
-            </w:pPr>
-            <w:r>
-              <w:rPr>
-                <w:b w:val="false"/>
-                <w:bCs w:val="false"/>
-                <w:color w:val="0F2A3D"/>
-                <w:sz w:val="20"/>
-                <w:szCs w:val="20"/>
-              </w:rPr>
-              <w:t xml:space="preserve">Additional upside — not included in base case</w:t>
+          </w:tcPr>
+          <w:p>
+            <w:r>
+              <w:t>₦40 billion</w:t>
             </w:r>
           </w:p>
         </w:tc>
@@ -4188,68 +3505,42 @@
         <w:tc>
           <w:tcPr>
             <w:tcW w:type="dxa" w:w="6480"/>
-            <w:tcBorders>
-              <w:top w:val="single" w:color="CCCCCC" w:sz="2"/>
-              <w:left w:val="single" w:color="CCCCCC" w:sz="2"/>
-              <w:bottom w:val="single" w:color="CCCCCC" w:sz="2"/>
-              <w:right w:val="single" w:color="CCCCCC" w:sz="2"/>
-            </w:tcBorders>
-            <w:shd w:fill="F7F7F7" w:val="clear"/>
-            <w:tcMar>
-              <w:top w:type="dxa" w:w="80"/>
-              <w:left w:type="dxa" w:w="120"/>
-              <w:bottom w:type="dxa" w:w="80"/>
-              <w:right w:type="dxa" w:w="120"/>
-            </w:tcMar>
-            <w:vAlign w:val="center"/>
-          </w:tcPr>
-          <w:p>
-            <w:pPr>
-              <w:jc w:val="left"/>
-            </w:pPr>
-            <w:r>
-              <w:rPr>
-                <w:b/>
-                <w:bCs/>
-                <w:color w:val="0F2A3D"/>
-                <w:sz w:val="20"/>
-                <w:szCs w:val="20"/>
-              </w:rPr>
-              <w:t xml:space="preserve">Phase 3 Hospital, School &amp; Apartments Income*</w:t>
+          </w:tcPr>
+          <w:p>
+            <w:r>
+              <w:t>Phase 2 Hotel &amp; Shopping Village Income*</w:t>
             </w:r>
           </w:p>
         </w:tc>
         <w:tc>
           <w:tcPr>
             <w:tcW w:type="dxa" w:w="3600"/>
-            <w:tcBorders>
-              <w:top w:val="single" w:color="CCCCCC" w:sz="2"/>
-              <w:left w:val="single" w:color="CCCCCC" w:sz="2"/>
-              <w:bottom w:val="single" w:color="CCCCCC" w:sz="2"/>
-              <w:right w:val="single" w:color="CCCCCC" w:sz="2"/>
-            </w:tcBorders>
-            <w:shd w:fill="F7F7F7" w:val="clear"/>
-            <w:tcMar>
-              <w:top w:type="dxa" w:w="80"/>
-              <w:left w:type="dxa" w:w="120"/>
-              <w:bottom w:type="dxa" w:w="80"/>
-              <w:right w:type="dxa" w:w="120"/>
-            </w:tcMar>
-            <w:vAlign w:val="center"/>
-          </w:tcPr>
-          <w:p>
-            <w:pPr>
-              <w:jc w:val="left"/>
-            </w:pPr>
-            <w:r>
-              <w:rPr>
-                <w:b w:val="false"/>
-                <w:bCs w:val="false"/>
-                <w:color w:val="0F2A3D"/>
-                <w:sz w:val="20"/>
-                <w:szCs w:val="20"/>
-              </w:rPr>
-              <w:t xml:space="preserve">Additional upside — not included in base case</w:t>
+          </w:tcPr>
+          <w:p>
+            <w:r>
+              <w:t>Additional upside — not included in base case</w:t>
+            </w:r>
+          </w:p>
+        </w:tc>
+      </w:tr>
+      <w:tr>
+        <w:tc>
+          <w:tcPr>
+            <w:tcW w:type="dxa" w:w="6480"/>
+          </w:tcPr>
+          <w:p>
+            <w:r>
+              <w:t>Phase 3 Hospital, School &amp; Apartments Income*</w:t>
+            </w:r>
+          </w:p>
+        </w:tc>
+        <w:tc>
+          <w:tcPr>
+            <w:tcW w:type="dxa" w:w="3600"/>
+          </w:tcPr>
+          <w:p>
+            <w:r>
+              <w:t>Additional upside — not included in base case</w:t>
             </w:r>
           </w:p>
         </w:tc>
@@ -4268,7 +3559,7 @@
           <w:sz w:val="18"/>
           <w:szCs w:val="18"/>
         </w:rPr>
-        <w:t xml:space="preserve">The ₦50 billion Phase 1 land-sale revenue figure is treated as the base-case, conservative revenue line for this plan. Duplex sales and Phase 2/3 hospitality, retail and healthcare income are real, additional revenue streams but are deliberately excluded from the base-case ROI calculation in Section 10 so that the headline return is not overstated.</w:t>
+        <w:t>The ₦40 billion Phase 1 revenue figure (₦12 billion from 120 serviced plots + ₦28 billion from 100 duplex unit sales) is the base-case revenue line for this plan. Duplex sales are now included in the base case for the first time in this corrected version, because the FCDA-compliant 25% statutory infrastructure reserve cuts the net residential land available for plot sales from 500 plots to 120 — plot sales alone are no longer sufficient to cover stated costs, so duplex sale revenue (previously held back as pure additional upside) is now needed to make the base case work, and is priced conservatively (Section 9.2 note). Phase 2/3 hospitality, retail and healthcare income remain real, additional revenue streams but stay excluded from the base-case ROI calculation in Section 10 so the headline return is not overstated.</w:t>
       </w:r>
     </w:p>
     <w:p>
@@ -4300,7 +3591,7 @@
         <w:jc w:val="both"/>
       </w:pPr>
       <w:r>
-        <w:t xml:space="preserve">Using only the costs explicitly stated in the brief — land acquisition (₦2.5B) and duplex construction (₦15B), total ₦17.5B — against the ₦50B Phase 1 land-sale revenue target (500 plots × ₦100M per 500 sqm plot, Section 9.2):</w:t>
+        <w:t>Using only the costs explicitly stated in the brief — land acquisition (₦2.5B) and duplex construction (₦15B), total ₦17.5B — against the ₦40B Phase 1 revenue target (120 plots × ₦100M per 500 sqm plot + 100 duplexes × ₦280M illustrative, Section 9.2):</w:t>
       </w:r>
     </w:p>
     <w:tbl>
@@ -4443,18 +3734,8 @@
             <w:vAlign w:val="center"/>
           </w:tcPr>
           <w:p>
-            <w:pPr>
-              <w:jc w:val="left"/>
-            </w:pPr>
-            <w:r>
-              <w:rPr>
-                <w:b w:val="false"/>
-                <w:bCs w:val="false"/>
-                <w:color w:val="0F2A3D"/>
-                <w:sz w:val="20"/>
-                <w:szCs w:val="20"/>
-              </w:rPr>
-              <w:t xml:space="preserve">₦17.5 billion</w:t>
+            <w:r>
+              <w:t>₦17.5 billion</w:t>
             </w:r>
           </w:p>
         </w:tc>
@@ -4470,6 +3751,56 @@
               <w:right w:val="single" w:color="CCCCCC" w:sz="2"/>
             </w:tcBorders>
             <w:shd w:fill="F7F7F7" w:val="clear"/>
+            <w:tcMar>
+              <w:top w:type="dxa" w:w="80"/>
+              <w:left w:type="dxa" w:w="120"/>
+              <w:bottom w:type="dxa" w:w="80"/>
+              <w:right w:type="dxa" w:w="120"/>
+            </w:tcMar>
+            <w:vAlign w:val="center"/>
+          </w:tcPr>
+          <w:p>
+            <w:r>
+              <w:t>Revenue (Plot + Duplex Sales)</w:t>
+            </w:r>
+          </w:p>
+        </w:tc>
+        <w:tc>
+          <w:tcPr>
+            <w:tcW w:type="dxa" w:w="3600"/>
+            <w:tcBorders>
+              <w:top w:val="single" w:color="CCCCCC" w:sz="2"/>
+              <w:left w:val="single" w:color="CCCCCC" w:sz="2"/>
+              <w:bottom w:val="single" w:color="CCCCCC" w:sz="2"/>
+              <w:right w:val="single" w:color="CCCCCC" w:sz="2"/>
+            </w:tcBorders>
+            <w:shd w:fill="F7F7F7" w:val="clear"/>
+            <w:tcMar>
+              <w:top w:type="dxa" w:w="80"/>
+              <w:left w:type="dxa" w:w="120"/>
+              <w:bottom w:type="dxa" w:w="80"/>
+              <w:right w:type="dxa" w:w="120"/>
+            </w:tcMar>
+            <w:vAlign w:val="center"/>
+          </w:tcPr>
+          <w:p>
+            <w:r>
+              <w:t>₦40 billion</w:t>
+            </w:r>
+          </w:p>
+        </w:tc>
+      </w:tr>
+      <w:tr>
+        <w:tc>
+          <w:tcPr>
+            <w:tcW w:type="dxa" w:w="6480"/>
+            <w:tcBorders>
+              <w:top w:val="single" w:color="CCCCCC" w:sz="2"/>
+              <w:left w:val="single" w:color="CCCCCC" w:sz="2"/>
+              <w:bottom w:val="single" w:color="CCCCCC" w:sz="2"/>
+              <w:right w:val="single" w:color="CCCCCC" w:sz="2"/>
+            </w:tcBorders>
+            <w:shd w:fill="FFFFFF" w:val="clear"/>
             <w:tcMar>
               <w:top w:type="dxa" w:w="80"/>
               <w:left w:type="dxa" w:w="120"/>
@@ -4490,7 +3821,7 @@
                 <w:sz w:val="20"/>
                 <w:szCs w:val="20"/>
               </w:rPr>
-              <w:t xml:space="preserve">Revenue (Site &amp; Serviced Land Sales)</w:t>
+              <w:t xml:space="preserve">Gross Profit</w:t>
             </w:r>
           </w:p>
         </w:tc>
@@ -4503,28 +3834,18 @@
               <w:bottom w:val="single" w:color="CCCCCC" w:sz="2"/>
               <w:right w:val="single" w:color="CCCCCC" w:sz="2"/>
             </w:tcBorders>
-            <w:shd w:fill="F7F7F7" w:val="clear"/>
-            <w:tcMar>
-              <w:top w:type="dxa" w:w="80"/>
-              <w:left w:type="dxa" w:w="120"/>
-              <w:bottom w:type="dxa" w:w="80"/>
-              <w:right w:type="dxa" w:w="120"/>
-            </w:tcMar>
-            <w:vAlign w:val="center"/>
-          </w:tcPr>
-          <w:p>
-            <w:pPr>
-              <w:jc w:val="left"/>
-            </w:pPr>
-            <w:r>
-              <w:rPr>
-                <w:b w:val="false"/>
-                <w:bCs w:val="false"/>
-                <w:color w:val="0F2A3D"/>
-                <w:sz w:val="20"/>
-                <w:szCs w:val="20"/>
-              </w:rPr>
-              <w:t xml:space="preserve">₦50 billion</w:t>
+            <w:shd w:fill="FFFFFF" w:val="clear"/>
+            <w:tcMar>
+              <w:top w:type="dxa" w:w="80"/>
+              <w:left w:type="dxa" w:w="120"/>
+              <w:bottom w:type="dxa" w:w="80"/>
+              <w:right w:type="dxa" w:w="120"/>
+            </w:tcMar>
+            <w:vAlign w:val="center"/>
+          </w:tcPr>
+          <w:p>
+            <w:r>
+              <w:t>₦22.5 billion</w:t>
             </w:r>
           </w:p>
         </w:tc>
@@ -4539,7 +3860,7 @@
               <w:bottom w:val="single" w:color="CCCCCC" w:sz="2"/>
               <w:right w:val="single" w:color="CCCCCC" w:sz="2"/>
             </w:tcBorders>
-            <w:shd w:fill="FFFFFF" w:val="clear"/>
+            <w:shd w:fill="F7F7F7" w:val="clear"/>
             <w:tcMar>
               <w:top w:type="dxa" w:w="80"/>
               <w:left w:type="dxa" w:w="120"/>
@@ -4560,7 +3881,7 @@
                 <w:sz w:val="20"/>
                 <w:szCs w:val="20"/>
               </w:rPr>
-              <w:t xml:space="preserve">Gross Profit</w:t>
+              <w:t xml:space="preserve">Return on Investment</w:t>
             </w:r>
           </w:p>
         </w:tc>
@@ -4573,28 +3894,18 @@
               <w:bottom w:val="single" w:color="CCCCCC" w:sz="2"/>
               <w:right w:val="single" w:color="CCCCCC" w:sz="2"/>
             </w:tcBorders>
-            <w:shd w:fill="FFFFFF" w:val="clear"/>
-            <w:tcMar>
-              <w:top w:type="dxa" w:w="80"/>
-              <w:left w:type="dxa" w:w="120"/>
-              <w:bottom w:type="dxa" w:w="80"/>
-              <w:right w:type="dxa" w:w="120"/>
-            </w:tcMar>
-            <w:vAlign w:val="center"/>
-          </w:tcPr>
-          <w:p>
-            <w:pPr>
-              <w:jc w:val="left"/>
-            </w:pPr>
-            <w:r>
-              <w:rPr>
-                <w:b w:val="false"/>
-                <w:bCs w:val="false"/>
-                <w:color w:val="0F2A3D"/>
-                <w:sz w:val="20"/>
-                <w:szCs w:val="20"/>
-              </w:rPr>
-              <w:t xml:space="preserve">₦32.5 billion</w:t>
+            <w:shd w:fill="F7F7F7" w:val="clear"/>
+            <w:tcMar>
+              <w:top w:type="dxa" w:w="80"/>
+              <w:left w:type="dxa" w:w="120"/>
+              <w:bottom w:type="dxa" w:w="80"/>
+              <w:right w:type="dxa" w:w="120"/>
+            </w:tcMar>
+            <w:vAlign w:val="center"/>
+          </w:tcPr>
+          <w:p>
+            <w:r>
+              <w:t>≈128.6%</w:t>
             </w:r>
           </w:p>
         </w:tc>
@@ -4609,7 +3920,7 @@
               <w:bottom w:val="single" w:color="CCCCCC" w:sz="2"/>
               <w:right w:val="single" w:color="CCCCCC" w:sz="2"/>
             </w:tcBorders>
-            <w:shd w:fill="F7F7F7" w:val="clear"/>
+            <w:shd w:fill="FFFFFF" w:val="clear"/>
             <w:tcMar>
               <w:top w:type="dxa" w:w="80"/>
               <w:left w:type="dxa" w:w="120"/>
@@ -4630,7 +3941,7 @@
                 <w:sz w:val="20"/>
                 <w:szCs w:val="20"/>
               </w:rPr>
-              <w:t xml:space="preserve">Return on Investment</w:t>
+              <w:t xml:space="preserve">Profit Margin (Profit / Revenue)</w:t>
             </w:r>
           </w:p>
         </w:tc>
@@ -4643,42 +3954,6 @@
               <w:bottom w:val="single" w:color="CCCCCC" w:sz="2"/>
               <w:right w:val="single" w:color="CCCCCC" w:sz="2"/>
             </w:tcBorders>
-            <w:shd w:fill="F7F7F7" w:val="clear"/>
-            <w:tcMar>
-              <w:top w:type="dxa" w:w="80"/>
-              <w:left w:type="dxa" w:w="120"/>
-              <w:bottom w:type="dxa" w:w="80"/>
-              <w:right w:type="dxa" w:w="120"/>
-            </w:tcMar>
-            <w:vAlign w:val="center"/>
-          </w:tcPr>
-          <w:p>
-            <w:pPr>
-              <w:jc w:val="left"/>
-            </w:pPr>
-            <w:r>
-              <w:rPr>
-                <w:b w:val="false"/>
-                <w:bCs w:val="false"/>
-                <w:color w:val="0F2A3D"/>
-                <w:sz w:val="20"/>
-                <w:szCs w:val="20"/>
-              </w:rPr>
-              <w:t xml:space="preserve">≈185.7%</w:t>
-            </w:r>
-          </w:p>
-        </w:tc>
-      </w:tr>
-      <w:tr>
-        <w:tc>
-          <w:tcPr>
-            <w:tcW w:type="dxa" w:w="6480"/>
-            <w:tcBorders>
-              <w:top w:val="single" w:color="CCCCCC" w:sz="2"/>
-              <w:left w:val="single" w:color="CCCCCC" w:sz="2"/>
-              <w:bottom w:val="single" w:color="CCCCCC" w:sz="2"/>
-              <w:right w:val="single" w:color="CCCCCC" w:sz="2"/>
-            </w:tcBorders>
             <w:shd w:fill="FFFFFF" w:val="clear"/>
             <w:tcMar>
               <w:top w:type="dxa" w:w="80"/>
@@ -4689,52 +3964,8 @@
             <w:vAlign w:val="center"/>
           </w:tcPr>
           <w:p>
-            <w:pPr>
-              <w:jc w:val="left"/>
-            </w:pPr>
-            <w:r>
-              <w:rPr>
-                <w:b/>
-                <w:bCs/>
-                <w:color w:val="0F2A3D"/>
-                <w:sz w:val="20"/>
-                <w:szCs w:val="20"/>
-              </w:rPr>
-              <w:t xml:space="preserve">Profit Margin (Profit / Revenue)</w:t>
-            </w:r>
-          </w:p>
-        </w:tc>
-        <w:tc>
-          <w:tcPr>
-            <w:tcW w:type="dxa" w:w="3600"/>
-            <w:tcBorders>
-              <w:top w:val="single" w:color="CCCCCC" w:sz="2"/>
-              <w:left w:val="single" w:color="CCCCCC" w:sz="2"/>
-              <w:bottom w:val="single" w:color="CCCCCC" w:sz="2"/>
-              <w:right w:val="single" w:color="CCCCCC" w:sz="2"/>
-            </w:tcBorders>
-            <w:shd w:fill="FFFFFF" w:val="clear"/>
-            <w:tcMar>
-              <w:top w:type="dxa" w:w="80"/>
-              <w:left w:type="dxa" w:w="120"/>
-              <w:bottom w:type="dxa" w:w="80"/>
-              <w:right w:type="dxa" w:w="120"/>
-            </w:tcMar>
-            <w:vAlign w:val="center"/>
-          </w:tcPr>
-          <w:p>
-            <w:pPr>
-              <w:jc w:val="left"/>
-            </w:pPr>
-            <w:r>
-              <w:rPr>
-                <w:b w:val="false"/>
-                <w:bCs w:val="false"/>
-                <w:color w:val="0F2A3D"/>
-                <w:sz w:val="20"/>
-                <w:szCs w:val="20"/>
-              </w:rPr>
-              <w:t xml:space="preserve">65%</w:t>
+            <w:r>
+              <w:t>56.3%</w:t>
             </w:r>
           </w:p>
         </w:tc>
@@ -4755,7 +3986,7 @@
         <w:jc w:val="both"/>
       </w:pPr>
       <w:r>
-        <w:t xml:space="preserve">To test how much room the project has for costs not itemized in the brief — golf course construction, clubhouse, roads, drainage, power, water, marketing and contingency — the analysis solves for the maximum total cost that still clears the 20% minimum ROI, holding revenue fixed at ₦50B:</w:t>
+        <w:t>To test how much room the project has for costs not itemized in the brief — golf course construction, clubhouse, roads, drainage, power, water, marketing and contingency — the analysis solves for the maximum total cost that still clears the 20% minimum ROI, holding revenue fixed at ₦40B:</w:t>
       </w:r>
     </w:p>
     <w:p>
@@ -5020,18 +4251,8 @@
             <w:vAlign w:val="center"/>
           </w:tcPr>
           <w:p>
-            <w:pPr>
-              <w:jc w:val="left"/>
-            </w:pPr>
-            <w:r>
-              <w:rPr>
-                <w:b w:val="false"/>
-                <w:bCs w:val="false"/>
-                <w:color w:val="0F2A3D"/>
-                <w:sz w:val="20"/>
-                <w:szCs w:val="20"/>
-              </w:rPr>
-              <w:t xml:space="preserve">₦50 billion</w:t>
+            <w:r>
+              <w:t>₦40 billion</w:t>
             </w:r>
           </w:p>
         </w:tc>
@@ -5090,18 +4311,8 @@
             <w:vAlign w:val="center"/>
           </w:tcPr>
           <w:p>
-            <w:pPr>
-              <w:jc w:val="left"/>
-            </w:pPr>
-            <w:r>
-              <w:rPr>
-                <w:b w:val="false"/>
-                <w:bCs w:val="false"/>
-                <w:color w:val="0F2A3D"/>
-                <w:sz w:val="20"/>
-                <w:szCs w:val="20"/>
-              </w:rPr>
-              <w:t xml:space="preserve">₦41.67 billion</w:t>
+            <w:r>
+              <w:t>₦33.33 billion</w:t>
             </w:r>
           </w:p>
         </w:tc>
@@ -5160,18 +4371,8 @@
             <w:vAlign w:val="center"/>
           </w:tcPr>
           <w:p>
-            <w:pPr>
-              <w:jc w:val="left"/>
-            </w:pPr>
-            <w:r>
-              <w:rPr>
-                <w:b w:val="false"/>
-                <w:bCs w:val="false"/>
-                <w:color w:val="0F2A3D"/>
-                <w:sz w:val="20"/>
-                <w:szCs w:val="20"/>
-              </w:rPr>
-              <w:t xml:space="preserve">₦24.17 billion</w:t>
+            <w:r>
+              <w:t>₦15.83 billion</w:t>
             </w:r>
           </w:p>
         </w:tc>
@@ -5230,18 +4431,8 @@
             <w:vAlign w:val="center"/>
           </w:tcPr>
           <w:p>
-            <w:pPr>
-              <w:jc w:val="left"/>
-            </w:pPr>
-            <w:r>
-              <w:rPr>
-                <w:b w:val="false"/>
-                <w:bCs w:val="false"/>
-                <w:color w:val="0F2A3D"/>
-                <w:sz w:val="20"/>
-                <w:szCs w:val="20"/>
-              </w:rPr>
-              <w:t xml:space="preserve">₦8.33 billion</w:t>
+            <w:r>
+              <w:t>₦6.67 billion</w:t>
             </w:r>
           </w:p>
         </w:tc>
@@ -5253,7 +4444,7 @@
         <w:jc w:val="both"/>
       </w:pPr>
       <w:r>
-        <w:t xml:space="preserve">In other words, the project can absorb up to ₦24.17 billion in additional, currently unquantified development costs — golf course construction, clubhouse, site infrastructure, marketing and contingency — and still deliver at least the 20% minimum return the sponsor has set, based on Phase 1 land sales alone. Any revenue from duplex sales or Phase 2/3 hospitality, retail and healthcare operations sits entirely on top of this floor as additional upside.</w:t>
+        <w:t>In other words, the project can absorb up to ₦15.83 billion in additional, currently unquantified development costs — golf course construction, clubhouse, site infrastructure (beyond the statutory 25% reserve already carved out in Section 3), marketing and contingency — and still deliver at least the 20% minimum return the sponsor has set, based on Phase 1 plot and duplex sales. Any revenue from Phase 2/3 hospitality, retail and healthcare operations sits entirely on top of this floor as additional upside.</w:t>
       </w:r>
     </w:p>
     <w:p>
@@ -5289,7 +4480,7 @@
         <w:jc w:val="both"/>
       </w:pPr>
       <w:r>
-        <w:t xml:space="preserve">Sections 10.1–10.2 stress-test cost and revenue one variable at a time. To make the viability case robust to scrutiny, the matrix below tests both simultaneously — what happens if costs run over the stated budget AND land-sale revenue falls short of the ₦50B target at the same time. Green cells clear the 20% ROI floor; amber cells are still profitable but below the floor; red cells are loss-making.</w:t>
+        <w:t>Sections 10.1–10.2 stress-test cost and revenue one variable at a time. To make the viability case robust to scrutiny, the matrix below tests both simultaneously — what happens if costs run over the stated budget AND Phase 1 revenue falls short of the ₦40B target at the same time. Green cells clear the 20% ROI floor; amber cells are still profitable but below the floor; red cells are loss-making.</w:t>
       </w:r>
     </w:p>
     <w:tbl>
@@ -5315,170 +4506,50 @@
         <w:tc>
           <w:tcPr>
             <w:tcW w:type="dxa" w:w="2280"/>
-            <w:tcBorders>
-              <w:top w:val="single" w:color="CCCCCC" w:sz="2"/>
-              <w:left w:val="single" w:color="CCCCCC" w:sz="2"/>
-              <w:bottom w:val="single" w:color="CCCCCC" w:sz="2"/>
-              <w:right w:val="single" w:color="CCCCCC" w:sz="2"/>
-            </w:tcBorders>
-            <w:shd w:fill="0F2A3D" w:val="clear"/>
-            <w:tcMar>
-              <w:top w:type="dxa" w:w="80"/>
-              <w:left w:type="dxa" w:w="120"/>
-              <w:bottom w:type="dxa" w:w="80"/>
-              <w:right w:type="dxa" w:w="120"/>
-            </w:tcMar>
-            <w:vAlign w:val="center"/>
-          </w:tcPr>
-          <w:p>
-            <w:pPr>
-              <w:jc w:val="left"/>
-            </w:pPr>
-            <w:r>
-              <w:rPr>
-                <w:b/>
-                <w:bCs/>
-                <w:color w:val="FFFFFF"/>
-                <w:sz w:val="16"/>
-                <w:szCs w:val="16"/>
-              </w:rPr>
-              <w:t xml:space="preserve">Revenue Achieved  vs.  Total Cost</w:t>
+          </w:tcPr>
+          <w:p>
+            <w:r>
+              <w:t>Revenue Achieved  vs.  Total Cost</w:t>
             </w:r>
           </w:p>
         </w:tc>
         <w:tc>
           <w:tcPr>
             <w:tcW w:type="dxa" w:w="1950"/>
-            <w:tcBorders>
-              <w:top w:val="single" w:color="CCCCCC" w:sz="2"/>
-              <w:left w:val="single" w:color="CCCCCC" w:sz="2"/>
-              <w:bottom w:val="single" w:color="CCCCCC" w:sz="2"/>
-              <w:right w:val="single" w:color="CCCCCC" w:sz="2"/>
-            </w:tcBorders>
-            <w:shd w:fill="0F2A3D" w:val="clear"/>
-            <w:tcMar>
-              <w:top w:type="dxa" w:w="80"/>
-              <w:left w:type="dxa" w:w="120"/>
-              <w:bottom w:type="dxa" w:w="80"/>
-              <w:right w:type="dxa" w:w="120"/>
-            </w:tcMar>
-            <w:vAlign w:val="center"/>
-          </w:tcPr>
-          <w:p>
-            <w:pPr>
-              <w:jc w:val="center"/>
-            </w:pPr>
-            <w:r>
-              <w:rPr>
-                <w:b/>
-                <w:bCs/>
-                <w:color w:val="FFFFFF"/>
-                <w:sz w:val="16"/>
-                <w:szCs w:val="16"/>
-              </w:rPr>
-              <w:t xml:space="preserve">Stated Cost ₦17.5B</w:t>
+          </w:tcPr>
+          <w:p>
+            <w:r>
+              <w:t>Stated Cost ₦17.5B</w:t>
             </w:r>
           </w:p>
         </w:tc>
         <w:tc>
           <w:tcPr>
             <w:tcW w:type="dxa" w:w="1950"/>
-            <w:tcBorders>
-              <w:top w:val="single" w:color="CCCCCC" w:sz="2"/>
-              <w:left w:val="single" w:color="CCCCCC" w:sz="2"/>
-              <w:bottom w:val="single" w:color="CCCCCC" w:sz="2"/>
-              <w:right w:val="single" w:color="CCCCCC" w:sz="2"/>
-            </w:tcBorders>
-            <w:shd w:fill="0F2A3D" w:val="clear"/>
-            <w:tcMar>
-              <w:top w:type="dxa" w:w="80"/>
-              <w:left w:type="dxa" w:w="120"/>
-              <w:bottom w:type="dxa" w:w="80"/>
-              <w:right w:type="dxa" w:w="120"/>
-            </w:tcMar>
-            <w:vAlign w:val="center"/>
-          </w:tcPr>
-          <w:p>
-            <w:pPr>
-              <w:jc w:val="center"/>
-            </w:pPr>
-            <w:r>
-              <w:rPr>
-                <w:b/>
-                <w:bCs/>
-                <w:color w:val="FFFFFF"/>
-                <w:sz w:val="16"/>
-                <w:szCs w:val="16"/>
-              </w:rPr>
-              <w:t xml:space="preserve">+50% Cost ₦26.25B</w:t>
+          </w:tcPr>
+          <w:p>
+            <w:r>
+              <w:t>+50% Cost ₦26.25B</w:t>
             </w:r>
           </w:p>
         </w:tc>
         <w:tc>
           <w:tcPr>
             <w:tcW w:type="dxa" w:w="1950"/>
-            <w:tcBorders>
-              <w:top w:val="single" w:color="CCCCCC" w:sz="2"/>
-              <w:left w:val="single" w:color="CCCCCC" w:sz="2"/>
-              <w:bottom w:val="single" w:color="CCCCCC" w:sz="2"/>
-              <w:right w:val="single" w:color="CCCCCC" w:sz="2"/>
-            </w:tcBorders>
-            <w:shd w:fill="0F2A3D" w:val="clear"/>
-            <w:tcMar>
-              <w:top w:type="dxa" w:w="80"/>
-              <w:left w:type="dxa" w:w="120"/>
-              <w:bottom w:type="dxa" w:w="80"/>
-              <w:right w:type="dxa" w:w="120"/>
-            </w:tcMar>
-            <w:vAlign w:val="center"/>
-          </w:tcPr>
-          <w:p>
-            <w:pPr>
-              <w:jc w:val="center"/>
-            </w:pPr>
-            <w:r>
-              <w:rPr>
-                <w:b/>
-                <w:bCs/>
-                <w:color w:val="FFFFFF"/>
-                <w:sz w:val="16"/>
-                <w:szCs w:val="16"/>
-              </w:rPr>
-              <w:t xml:space="preserve">+100% Cost ₦35B</w:t>
+          </w:tcPr>
+          <w:p>
+            <w:r>
+              <w:t>20% ROI Floor ₦33.33B</w:t>
             </w:r>
           </w:p>
         </w:tc>
         <w:tc>
           <w:tcPr>
             <w:tcW w:type="dxa" w:w="1950"/>
-            <w:tcBorders>
-              <w:top w:val="single" w:color="CCCCCC" w:sz="2"/>
-              <w:left w:val="single" w:color="CCCCCC" w:sz="2"/>
-              <w:bottom w:val="single" w:color="CCCCCC" w:sz="2"/>
-              <w:right w:val="single" w:color="CCCCCC" w:sz="2"/>
-            </w:tcBorders>
-            <w:shd w:fill="0F2A3D" w:val="clear"/>
-            <w:tcMar>
-              <w:top w:type="dxa" w:w="80"/>
-              <w:left w:type="dxa" w:w="120"/>
-              <w:bottom w:type="dxa" w:w="80"/>
-              <w:right w:type="dxa" w:w="120"/>
-            </w:tcMar>
-            <w:vAlign w:val="center"/>
-          </w:tcPr>
-          <w:p>
-            <w:pPr>
-              <w:jc w:val="center"/>
-            </w:pPr>
-            <w:r>
-              <w:rPr>
-                <w:b/>
-                <w:bCs/>
-                <w:color w:val="FFFFFF"/>
-                <w:sz w:val="16"/>
-                <w:szCs w:val="16"/>
-              </w:rPr>
-              <w:t xml:space="preserve">Max Buffer ₦41.67B</w:t>
+          </w:tcPr>
+          <w:p>
+            <w:r>
+              <w:t>+100% Cost ₦35B</w:t>
             </w:r>
           </w:p>
         </w:tc>
@@ -5487,170 +4558,50 @@
         <w:tc>
           <w:tcPr>
             <w:tcW w:type="dxa" w:w="2280"/>
-            <w:tcBorders>
-              <w:top w:val="single" w:color="CCCCCC" w:sz="2"/>
-              <w:left w:val="single" w:color="CCCCCC" w:sz="2"/>
-              <w:bottom w:val="single" w:color="CCCCCC" w:sz="2"/>
-              <w:right w:val="single" w:color="CCCCCC" w:sz="2"/>
-            </w:tcBorders>
-            <w:shd w:fill="F0F0F0" w:val="clear"/>
-            <w:tcMar>
-              <w:top w:type="dxa" w:w="80"/>
-              <w:left w:type="dxa" w:w="120"/>
-              <w:bottom w:type="dxa" w:w="80"/>
-              <w:right w:type="dxa" w:w="120"/>
-            </w:tcMar>
-            <w:vAlign w:val="center"/>
-          </w:tcPr>
-          <w:p>
-            <w:pPr>
-              <w:jc w:val="left"/>
-            </w:pPr>
-            <w:r>
-              <w:rPr>
-                <w:b/>
-                <w:bCs/>
-                <w:color w:val="0F2A3D"/>
-                <w:sz w:val="17"/>
-                <w:szCs w:val="17"/>
-              </w:rPr>
-              <w:t xml:space="preserve">Revenue 100% (₦50B)</w:t>
+          </w:tcPr>
+          <w:p>
+            <w:r>
+              <w:t>Revenue 100% (₦40B)</w:t>
             </w:r>
           </w:p>
         </w:tc>
         <w:tc>
           <w:tcPr>
             <w:tcW w:type="dxa" w:w="1950"/>
-            <w:tcBorders>
-              <w:top w:val="single" w:color="CCCCCC" w:sz="2"/>
-              <w:left w:val="single" w:color="CCCCCC" w:sz="2"/>
-              <w:bottom w:val="single" w:color="CCCCCC" w:sz="2"/>
-              <w:right w:val="single" w:color="CCCCCC" w:sz="2"/>
-            </w:tcBorders>
-            <w:shd w:fill="E8F0EA" w:val="clear"/>
-            <w:tcMar>
-              <w:top w:type="dxa" w:w="80"/>
-              <w:left w:type="dxa" w:w="120"/>
-              <w:bottom w:type="dxa" w:w="80"/>
-              <w:right w:type="dxa" w:w="120"/>
-            </w:tcMar>
-            <w:vAlign w:val="center"/>
-          </w:tcPr>
-          <w:p>
-            <w:pPr>
-              <w:jc w:val="center"/>
-            </w:pPr>
-            <w:r>
-              <w:rPr>
-                <w:b w:val="false"/>
-                <w:bCs w:val="false"/>
-                <w:color w:val="0F2A3D"/>
-                <w:sz w:val="16"/>
-                <w:szCs w:val="16"/>
-              </w:rPr>
-              <w:t xml:space="preserve">+185.7% PASS</w:t>
+          </w:tcPr>
+          <w:p>
+            <w:r>
+              <w:t>+128.6% PASS</w:t>
             </w:r>
           </w:p>
         </w:tc>
         <w:tc>
           <w:tcPr>
             <w:tcW w:type="dxa" w:w="1950"/>
-            <w:tcBorders>
-              <w:top w:val="single" w:color="CCCCCC" w:sz="2"/>
-              <w:left w:val="single" w:color="CCCCCC" w:sz="2"/>
-              <w:bottom w:val="single" w:color="CCCCCC" w:sz="2"/>
-              <w:right w:val="single" w:color="CCCCCC" w:sz="2"/>
-            </w:tcBorders>
-            <w:shd w:fill="E8F0EA" w:val="clear"/>
-            <w:tcMar>
-              <w:top w:type="dxa" w:w="80"/>
-              <w:left w:type="dxa" w:w="120"/>
-              <w:bottom w:type="dxa" w:w="80"/>
-              <w:right w:type="dxa" w:w="120"/>
-            </w:tcMar>
-            <w:vAlign w:val="center"/>
-          </w:tcPr>
-          <w:p>
-            <w:pPr>
-              <w:jc w:val="center"/>
-            </w:pPr>
-            <w:r>
-              <w:rPr>
-                <w:b w:val="false"/>
-                <w:bCs w:val="false"/>
-                <w:color w:val="0F2A3D"/>
-                <w:sz w:val="16"/>
-                <w:szCs w:val="16"/>
-              </w:rPr>
-              <w:t xml:space="preserve">+90.5% PASS</w:t>
+          </w:tcPr>
+          <w:p>
+            <w:r>
+              <w:t>+52.4% PASS</w:t>
             </w:r>
           </w:p>
         </w:tc>
         <w:tc>
           <w:tcPr>
             <w:tcW w:type="dxa" w:w="1950"/>
-            <w:tcBorders>
-              <w:top w:val="single" w:color="CCCCCC" w:sz="2"/>
-              <w:left w:val="single" w:color="CCCCCC" w:sz="2"/>
-              <w:bottom w:val="single" w:color="CCCCCC" w:sz="2"/>
-              <w:right w:val="single" w:color="CCCCCC" w:sz="2"/>
-            </w:tcBorders>
-            <w:shd w:fill="E8F0EA" w:val="clear"/>
-            <w:tcMar>
-              <w:top w:type="dxa" w:w="80"/>
-              <w:left w:type="dxa" w:w="120"/>
-              <w:bottom w:type="dxa" w:w="80"/>
-              <w:right w:type="dxa" w:w="120"/>
-            </w:tcMar>
-            <w:vAlign w:val="center"/>
-          </w:tcPr>
-          <w:p>
-            <w:pPr>
-              <w:jc w:val="center"/>
-            </w:pPr>
-            <w:r>
-              <w:rPr>
-                <w:b w:val="false"/>
-                <w:bCs w:val="false"/>
-                <w:color w:val="0F2A3D"/>
-                <w:sz w:val="16"/>
-                <w:szCs w:val="16"/>
-              </w:rPr>
-              <w:t xml:space="preserve">+42.9% PASS</w:t>
+          </w:tcPr>
+          <w:p>
+            <w:r>
+              <w:t>+20.0% PASS</w:t>
             </w:r>
           </w:p>
         </w:tc>
         <w:tc>
           <w:tcPr>
             <w:tcW w:type="dxa" w:w="1950"/>
-            <w:tcBorders>
-              <w:top w:val="single" w:color="CCCCCC" w:sz="2"/>
-              <w:left w:val="single" w:color="CCCCCC" w:sz="2"/>
-              <w:bottom w:val="single" w:color="CCCCCC" w:sz="2"/>
-              <w:right w:val="single" w:color="CCCCCC" w:sz="2"/>
-            </w:tcBorders>
-            <w:shd w:fill="FBF3DD" w:val="clear"/>
-            <w:tcMar>
-              <w:top w:type="dxa" w:w="80"/>
-              <w:left w:type="dxa" w:w="120"/>
-              <w:bottom w:type="dxa" w:w="80"/>
-              <w:right w:type="dxa" w:w="120"/>
-            </w:tcMar>
-            <w:vAlign w:val="center"/>
-          </w:tcPr>
-          <w:p>
-            <w:pPr>
-              <w:jc w:val="center"/>
-            </w:pPr>
-            <w:r>
-              <w:rPr>
-                <w:b w:val="false"/>
-                <w:bCs w:val="false"/>
-                <w:color w:val="0F2A3D"/>
-                <w:sz w:val="16"/>
-                <w:szCs w:val="16"/>
-              </w:rPr>
-              <w:t xml:space="preserve">+20.0% MARGINAL</w:t>
+          </w:tcPr>
+          <w:p>
+            <w:r>
+              <w:t>+14.3% MARGINAL</w:t>
             </w:r>
           </w:p>
         </w:tc>
@@ -5659,170 +4610,50 @@
         <w:tc>
           <w:tcPr>
             <w:tcW w:type="dxa" w:w="2280"/>
-            <w:tcBorders>
-              <w:top w:val="single" w:color="CCCCCC" w:sz="2"/>
-              <w:left w:val="single" w:color="CCCCCC" w:sz="2"/>
-              <w:bottom w:val="single" w:color="CCCCCC" w:sz="2"/>
-              <w:right w:val="single" w:color="CCCCCC" w:sz="2"/>
-            </w:tcBorders>
-            <w:shd w:fill="F0F0F0" w:val="clear"/>
-            <w:tcMar>
-              <w:top w:type="dxa" w:w="80"/>
-              <w:left w:type="dxa" w:w="120"/>
-              <w:bottom w:type="dxa" w:w="80"/>
-              <w:right w:type="dxa" w:w="120"/>
-            </w:tcMar>
-            <w:vAlign w:val="center"/>
-          </w:tcPr>
-          <w:p>
-            <w:pPr>
-              <w:jc w:val="left"/>
-            </w:pPr>
-            <w:r>
-              <w:rPr>
-                <w:b/>
-                <w:bCs/>
-                <w:color w:val="0F2A3D"/>
-                <w:sz w:val="17"/>
-                <w:szCs w:val="17"/>
-              </w:rPr>
-              <w:t xml:space="preserve">Revenue 90% (₦45B)</w:t>
+          </w:tcPr>
+          <w:p>
+            <w:r>
+              <w:t>Revenue 90% (₦36B)</w:t>
             </w:r>
           </w:p>
         </w:tc>
         <w:tc>
           <w:tcPr>
             <w:tcW w:type="dxa" w:w="1950"/>
-            <w:tcBorders>
-              <w:top w:val="single" w:color="CCCCCC" w:sz="2"/>
-              <w:left w:val="single" w:color="CCCCCC" w:sz="2"/>
-              <w:bottom w:val="single" w:color="CCCCCC" w:sz="2"/>
-              <w:right w:val="single" w:color="CCCCCC" w:sz="2"/>
-            </w:tcBorders>
-            <w:shd w:fill="E8F0EA" w:val="clear"/>
-            <w:tcMar>
-              <w:top w:type="dxa" w:w="80"/>
-              <w:left w:type="dxa" w:w="120"/>
-              <w:bottom w:type="dxa" w:w="80"/>
-              <w:right w:type="dxa" w:w="120"/>
-            </w:tcMar>
-            <w:vAlign w:val="center"/>
-          </w:tcPr>
-          <w:p>
-            <w:pPr>
-              <w:jc w:val="center"/>
-            </w:pPr>
-            <w:r>
-              <w:rPr>
-                <w:b w:val="false"/>
-                <w:bCs w:val="false"/>
-                <w:color w:val="0F2A3D"/>
-                <w:sz w:val="16"/>
-                <w:szCs w:val="16"/>
-              </w:rPr>
-              <w:t xml:space="preserve">+157.1% PASS</w:t>
+          </w:tcPr>
+          <w:p>
+            <w:r>
+              <w:t>+105.7% PASS</w:t>
             </w:r>
           </w:p>
         </w:tc>
         <w:tc>
           <w:tcPr>
             <w:tcW w:type="dxa" w:w="1950"/>
-            <w:tcBorders>
-              <w:top w:val="single" w:color="CCCCCC" w:sz="2"/>
-              <w:left w:val="single" w:color="CCCCCC" w:sz="2"/>
-              <w:bottom w:val="single" w:color="CCCCCC" w:sz="2"/>
-              <w:right w:val="single" w:color="CCCCCC" w:sz="2"/>
-            </w:tcBorders>
-            <w:shd w:fill="E8F0EA" w:val="clear"/>
-            <w:tcMar>
-              <w:top w:type="dxa" w:w="80"/>
-              <w:left w:type="dxa" w:w="120"/>
-              <w:bottom w:type="dxa" w:w="80"/>
-              <w:right w:type="dxa" w:w="120"/>
-            </w:tcMar>
-            <w:vAlign w:val="center"/>
-          </w:tcPr>
-          <w:p>
-            <w:pPr>
-              <w:jc w:val="center"/>
-            </w:pPr>
-            <w:r>
-              <w:rPr>
-                <w:b w:val="false"/>
-                <w:bCs w:val="false"/>
-                <w:color w:val="0F2A3D"/>
-                <w:sz w:val="16"/>
-                <w:szCs w:val="16"/>
-              </w:rPr>
-              <w:t xml:space="preserve">+71.4% PASS</w:t>
+          </w:tcPr>
+          <w:p>
+            <w:r>
+              <w:t>+37.1% PASS</w:t>
             </w:r>
           </w:p>
         </w:tc>
         <w:tc>
           <w:tcPr>
             <w:tcW w:type="dxa" w:w="1950"/>
-            <w:tcBorders>
-              <w:top w:val="single" w:color="CCCCCC" w:sz="2"/>
-              <w:left w:val="single" w:color="CCCCCC" w:sz="2"/>
-              <w:bottom w:val="single" w:color="CCCCCC" w:sz="2"/>
-              <w:right w:val="single" w:color="CCCCCC" w:sz="2"/>
-            </w:tcBorders>
-            <w:shd w:fill="E8F0EA" w:val="clear"/>
-            <w:tcMar>
-              <w:top w:type="dxa" w:w="80"/>
-              <w:left w:type="dxa" w:w="120"/>
-              <w:bottom w:type="dxa" w:w="80"/>
-              <w:right w:type="dxa" w:w="120"/>
-            </w:tcMar>
-            <w:vAlign w:val="center"/>
-          </w:tcPr>
-          <w:p>
-            <w:pPr>
-              <w:jc w:val="center"/>
-            </w:pPr>
-            <w:r>
-              <w:rPr>
-                <w:b w:val="false"/>
-                <w:bCs w:val="false"/>
-                <w:color w:val="0F2A3D"/>
-                <w:sz w:val="16"/>
-                <w:szCs w:val="16"/>
-              </w:rPr>
-              <w:t xml:space="preserve">+28.6% PASS</w:t>
+          </w:tcPr>
+          <w:p>
+            <w:r>
+              <w:t>+8.0% MARGINAL</w:t>
             </w:r>
           </w:p>
         </w:tc>
         <w:tc>
           <w:tcPr>
             <w:tcW w:type="dxa" w:w="1950"/>
-            <w:tcBorders>
-              <w:top w:val="single" w:color="CCCCCC" w:sz="2"/>
-              <w:left w:val="single" w:color="CCCCCC" w:sz="2"/>
-              <w:bottom w:val="single" w:color="CCCCCC" w:sz="2"/>
-              <w:right w:val="single" w:color="CCCCCC" w:sz="2"/>
-            </w:tcBorders>
-            <w:shd w:fill="FBF3DD" w:val="clear"/>
-            <w:tcMar>
-              <w:top w:type="dxa" w:w="80"/>
-              <w:left w:type="dxa" w:w="120"/>
-              <w:bottom w:type="dxa" w:w="80"/>
-              <w:right w:type="dxa" w:w="120"/>
-            </w:tcMar>
-            <w:vAlign w:val="center"/>
-          </w:tcPr>
-          <w:p>
-            <w:pPr>
-              <w:jc w:val="center"/>
-            </w:pPr>
-            <w:r>
-              <w:rPr>
-                <w:b w:val="false"/>
-                <w:bCs w:val="false"/>
-                <w:color w:val="0F2A3D"/>
-                <w:sz w:val="16"/>
-                <w:szCs w:val="16"/>
-              </w:rPr>
-              <w:t xml:space="preserve">+8.0% MARGINAL</w:t>
+          </w:tcPr>
+          <w:p>
+            <w:r>
+              <w:t>+2.9% MARGINAL</w:t>
             </w:r>
           </w:p>
         </w:tc>
@@ -5831,170 +4662,50 @@
         <w:tc>
           <w:tcPr>
             <w:tcW w:type="dxa" w:w="2280"/>
-            <w:tcBorders>
-              <w:top w:val="single" w:color="CCCCCC" w:sz="2"/>
-              <w:left w:val="single" w:color="CCCCCC" w:sz="2"/>
-              <w:bottom w:val="single" w:color="CCCCCC" w:sz="2"/>
-              <w:right w:val="single" w:color="CCCCCC" w:sz="2"/>
-            </w:tcBorders>
-            <w:shd w:fill="F0F0F0" w:val="clear"/>
-            <w:tcMar>
-              <w:top w:type="dxa" w:w="80"/>
-              <w:left w:type="dxa" w:w="120"/>
-              <w:bottom w:type="dxa" w:w="80"/>
-              <w:right w:type="dxa" w:w="120"/>
-            </w:tcMar>
-            <w:vAlign w:val="center"/>
-          </w:tcPr>
-          <w:p>
-            <w:pPr>
-              <w:jc w:val="left"/>
-            </w:pPr>
-            <w:r>
-              <w:rPr>
-                <w:b/>
-                <w:bCs/>
-                <w:color w:val="0F2A3D"/>
-                <w:sz w:val="17"/>
-                <w:szCs w:val="17"/>
-              </w:rPr>
-              <w:t xml:space="preserve">Revenue 80% (₦40B)</w:t>
+          </w:tcPr>
+          <w:p>
+            <w:r>
+              <w:t>Revenue 80% (₦32B)</w:t>
             </w:r>
           </w:p>
         </w:tc>
         <w:tc>
           <w:tcPr>
             <w:tcW w:type="dxa" w:w="1950"/>
-            <w:tcBorders>
-              <w:top w:val="single" w:color="CCCCCC" w:sz="2"/>
-              <w:left w:val="single" w:color="CCCCCC" w:sz="2"/>
-              <w:bottom w:val="single" w:color="CCCCCC" w:sz="2"/>
-              <w:right w:val="single" w:color="CCCCCC" w:sz="2"/>
-            </w:tcBorders>
-            <w:shd w:fill="E8F0EA" w:val="clear"/>
-            <w:tcMar>
-              <w:top w:type="dxa" w:w="80"/>
-              <w:left w:type="dxa" w:w="120"/>
-              <w:bottom w:type="dxa" w:w="80"/>
-              <w:right w:type="dxa" w:w="120"/>
-            </w:tcMar>
-            <w:vAlign w:val="center"/>
-          </w:tcPr>
-          <w:p>
-            <w:pPr>
-              <w:jc w:val="center"/>
-            </w:pPr>
-            <w:r>
-              <w:rPr>
-                <w:b w:val="false"/>
-                <w:bCs w:val="false"/>
-                <w:color w:val="0F2A3D"/>
-                <w:sz w:val="16"/>
-                <w:szCs w:val="16"/>
-              </w:rPr>
-              <w:t xml:space="preserve">+128.6% PASS</w:t>
+          </w:tcPr>
+          <w:p>
+            <w:r>
+              <w:t>+82.9% PASS</w:t>
             </w:r>
           </w:p>
         </w:tc>
         <w:tc>
           <w:tcPr>
             <w:tcW w:type="dxa" w:w="1950"/>
-            <w:tcBorders>
-              <w:top w:val="single" w:color="CCCCCC" w:sz="2"/>
-              <w:left w:val="single" w:color="CCCCCC" w:sz="2"/>
-              <w:bottom w:val="single" w:color="CCCCCC" w:sz="2"/>
-              <w:right w:val="single" w:color="CCCCCC" w:sz="2"/>
-            </w:tcBorders>
-            <w:shd w:fill="E8F0EA" w:val="clear"/>
-            <w:tcMar>
-              <w:top w:type="dxa" w:w="80"/>
-              <w:left w:type="dxa" w:w="120"/>
-              <w:bottom w:type="dxa" w:w="80"/>
-              <w:right w:type="dxa" w:w="120"/>
-            </w:tcMar>
-            <w:vAlign w:val="center"/>
-          </w:tcPr>
-          <w:p>
-            <w:pPr>
-              <w:jc w:val="center"/>
-            </w:pPr>
-            <w:r>
-              <w:rPr>
-                <w:b w:val="false"/>
-                <w:bCs w:val="false"/>
-                <w:color w:val="0F2A3D"/>
-                <w:sz w:val="16"/>
-                <w:szCs w:val="16"/>
-              </w:rPr>
-              <w:t xml:space="preserve">+52.4% PASS</w:t>
+          </w:tcPr>
+          <w:p>
+            <w:r>
+              <w:t>+21.9% PASS</w:t>
             </w:r>
           </w:p>
         </w:tc>
         <w:tc>
           <w:tcPr>
             <w:tcW w:type="dxa" w:w="1950"/>
-            <w:tcBorders>
-              <w:top w:val="single" w:color="CCCCCC" w:sz="2"/>
-              <w:left w:val="single" w:color="CCCCCC" w:sz="2"/>
-              <w:bottom w:val="single" w:color="CCCCCC" w:sz="2"/>
-              <w:right w:val="single" w:color="CCCCCC" w:sz="2"/>
-            </w:tcBorders>
-            <w:shd w:fill="FBF3DD" w:val="clear"/>
-            <w:tcMar>
-              <w:top w:type="dxa" w:w="80"/>
-              <w:left w:type="dxa" w:w="120"/>
-              <w:bottom w:type="dxa" w:w="80"/>
-              <w:right w:type="dxa" w:w="120"/>
-            </w:tcMar>
-            <w:vAlign w:val="center"/>
-          </w:tcPr>
-          <w:p>
-            <w:pPr>
-              <w:jc w:val="center"/>
-            </w:pPr>
-            <w:r>
-              <w:rPr>
-                <w:b w:val="false"/>
-                <w:bCs w:val="false"/>
-                <w:color w:val="0F2A3D"/>
-                <w:sz w:val="16"/>
-                <w:szCs w:val="16"/>
-              </w:rPr>
-              <w:t xml:space="preserve">+14.3% MARGINAL</w:t>
+          </w:tcPr>
+          <w:p>
+            <w:r>
+              <w:t>-4.0% LOSS</w:t>
             </w:r>
           </w:p>
         </w:tc>
         <w:tc>
           <w:tcPr>
             <w:tcW w:type="dxa" w:w="1950"/>
-            <w:tcBorders>
-              <w:top w:val="single" w:color="CCCCCC" w:sz="2"/>
-              <w:left w:val="single" w:color="CCCCCC" w:sz="2"/>
-              <w:bottom w:val="single" w:color="CCCCCC" w:sz="2"/>
-              <w:right w:val="single" w:color="CCCCCC" w:sz="2"/>
-            </w:tcBorders>
-            <w:shd w:fill="FBE9E9" w:val="clear"/>
-            <w:tcMar>
-              <w:top w:type="dxa" w:w="80"/>
-              <w:left w:type="dxa" w:w="120"/>
-              <w:bottom w:type="dxa" w:w="80"/>
-              <w:right w:type="dxa" w:w="120"/>
-            </w:tcMar>
-            <w:vAlign w:val="center"/>
-          </w:tcPr>
-          <w:p>
-            <w:pPr>
-              <w:jc w:val="center"/>
-            </w:pPr>
-            <w:r>
-              <w:rPr>
-                <w:b w:val="false"/>
-                <w:bCs w:val="false"/>
-                <w:color w:val="0F2A3D"/>
-                <w:sz w:val="16"/>
-                <w:szCs w:val="16"/>
-              </w:rPr>
-              <w:t xml:space="preserve">-4.0% LOSS</w:t>
+          </w:tcPr>
+          <w:p>
+            <w:r>
+              <w:t>-8.6% LOSS</w:t>
             </w:r>
           </w:p>
         </w:tc>
@@ -6003,170 +4714,50 @@
         <w:tc>
           <w:tcPr>
             <w:tcW w:type="dxa" w:w="2280"/>
-            <w:tcBorders>
-              <w:top w:val="single" w:color="CCCCCC" w:sz="2"/>
-              <w:left w:val="single" w:color="CCCCCC" w:sz="2"/>
-              <w:bottom w:val="single" w:color="CCCCCC" w:sz="2"/>
-              <w:right w:val="single" w:color="CCCCCC" w:sz="2"/>
-            </w:tcBorders>
-            <w:shd w:fill="F0F0F0" w:val="clear"/>
-            <w:tcMar>
-              <w:top w:type="dxa" w:w="80"/>
-              <w:left w:type="dxa" w:w="120"/>
-              <w:bottom w:type="dxa" w:w="80"/>
-              <w:right w:type="dxa" w:w="120"/>
-            </w:tcMar>
-            <w:vAlign w:val="center"/>
-          </w:tcPr>
-          <w:p>
-            <w:pPr>
-              <w:jc w:val="left"/>
-            </w:pPr>
-            <w:r>
-              <w:rPr>
-                <w:b/>
-                <w:bCs/>
-                <w:color w:val="0F2A3D"/>
-                <w:sz w:val="17"/>
-                <w:szCs w:val="17"/>
-              </w:rPr>
-              <w:t xml:space="preserve">Revenue 70% (₦35B)</w:t>
+          </w:tcPr>
+          <w:p>
+            <w:r>
+              <w:t>Revenue 70% (₦28B)</w:t>
             </w:r>
           </w:p>
         </w:tc>
         <w:tc>
           <w:tcPr>
             <w:tcW w:type="dxa" w:w="1950"/>
-            <w:tcBorders>
-              <w:top w:val="single" w:color="CCCCCC" w:sz="2"/>
-              <w:left w:val="single" w:color="CCCCCC" w:sz="2"/>
-              <w:bottom w:val="single" w:color="CCCCCC" w:sz="2"/>
-              <w:right w:val="single" w:color="CCCCCC" w:sz="2"/>
-            </w:tcBorders>
-            <w:shd w:fill="E8F0EA" w:val="clear"/>
-            <w:tcMar>
-              <w:top w:type="dxa" w:w="80"/>
-              <w:left w:type="dxa" w:w="120"/>
-              <w:bottom w:type="dxa" w:w="80"/>
-              <w:right w:type="dxa" w:w="120"/>
-            </w:tcMar>
-            <w:vAlign w:val="center"/>
-          </w:tcPr>
-          <w:p>
-            <w:pPr>
-              <w:jc w:val="center"/>
-            </w:pPr>
-            <w:r>
-              <w:rPr>
-                <w:b w:val="false"/>
-                <w:bCs w:val="false"/>
-                <w:color w:val="0F2A3D"/>
-                <w:sz w:val="16"/>
-                <w:szCs w:val="16"/>
-              </w:rPr>
-              <w:t xml:space="preserve">+100.0% PASS</w:t>
+          </w:tcPr>
+          <w:p>
+            <w:r>
+              <w:t>+60.0% PASS</w:t>
             </w:r>
           </w:p>
         </w:tc>
         <w:tc>
           <w:tcPr>
             <w:tcW w:type="dxa" w:w="1950"/>
-            <w:tcBorders>
-              <w:top w:val="single" w:color="CCCCCC" w:sz="2"/>
-              <w:left w:val="single" w:color="CCCCCC" w:sz="2"/>
-              <w:bottom w:val="single" w:color="CCCCCC" w:sz="2"/>
-              <w:right w:val="single" w:color="CCCCCC" w:sz="2"/>
-            </w:tcBorders>
-            <w:shd w:fill="E8F0EA" w:val="clear"/>
-            <w:tcMar>
-              <w:top w:type="dxa" w:w="80"/>
-              <w:left w:type="dxa" w:w="120"/>
-              <w:bottom w:type="dxa" w:w="80"/>
-              <w:right w:type="dxa" w:w="120"/>
-            </w:tcMar>
-            <w:vAlign w:val="center"/>
-          </w:tcPr>
-          <w:p>
-            <w:pPr>
-              <w:jc w:val="center"/>
-            </w:pPr>
-            <w:r>
-              <w:rPr>
-                <w:b w:val="false"/>
-                <w:bCs w:val="false"/>
-                <w:color w:val="0F2A3D"/>
-                <w:sz w:val="16"/>
-                <w:szCs w:val="16"/>
-              </w:rPr>
-              <w:t xml:space="preserve">+33.3% PASS</w:t>
+          </w:tcPr>
+          <w:p>
+            <w:r>
+              <w:t>+6.7% MARGINAL</w:t>
             </w:r>
           </w:p>
         </w:tc>
         <w:tc>
           <w:tcPr>
             <w:tcW w:type="dxa" w:w="1950"/>
-            <w:tcBorders>
-              <w:top w:val="single" w:color="CCCCCC" w:sz="2"/>
-              <w:left w:val="single" w:color="CCCCCC" w:sz="2"/>
-              <w:bottom w:val="single" w:color="CCCCCC" w:sz="2"/>
-              <w:right w:val="single" w:color="CCCCCC" w:sz="2"/>
-            </w:tcBorders>
-            <w:shd w:fill="FBF3DD" w:val="clear"/>
-            <w:tcMar>
-              <w:top w:type="dxa" w:w="80"/>
-              <w:left w:type="dxa" w:w="120"/>
-              <w:bottom w:type="dxa" w:w="80"/>
-              <w:right w:type="dxa" w:w="120"/>
-            </w:tcMar>
-            <w:vAlign w:val="center"/>
-          </w:tcPr>
-          <w:p>
-            <w:pPr>
-              <w:jc w:val="center"/>
-            </w:pPr>
-            <w:r>
-              <w:rPr>
-                <w:b w:val="false"/>
-                <w:bCs w:val="false"/>
-                <w:color w:val="0F2A3D"/>
-                <w:sz w:val="16"/>
-                <w:szCs w:val="16"/>
-              </w:rPr>
-              <w:t xml:space="preserve">+0.0% MARGINAL</w:t>
+          </w:tcPr>
+          <w:p>
+            <w:r>
+              <w:t>-16.0% LOSS</w:t>
             </w:r>
           </w:p>
         </w:tc>
         <w:tc>
           <w:tcPr>
             <w:tcW w:type="dxa" w:w="1950"/>
-            <w:tcBorders>
-              <w:top w:val="single" w:color="CCCCCC" w:sz="2"/>
-              <w:left w:val="single" w:color="CCCCCC" w:sz="2"/>
-              <w:bottom w:val="single" w:color="CCCCCC" w:sz="2"/>
-              <w:right w:val="single" w:color="CCCCCC" w:sz="2"/>
-            </w:tcBorders>
-            <w:shd w:fill="FBE9E9" w:val="clear"/>
-            <w:tcMar>
-              <w:top w:type="dxa" w:w="80"/>
-              <w:left w:type="dxa" w:w="120"/>
-              <w:bottom w:type="dxa" w:w="80"/>
-              <w:right w:type="dxa" w:w="120"/>
-            </w:tcMar>
-            <w:vAlign w:val="center"/>
-          </w:tcPr>
-          <w:p>
-            <w:pPr>
-              <w:jc w:val="center"/>
-            </w:pPr>
-            <w:r>
-              <w:rPr>
-                <w:b w:val="false"/>
-                <w:bCs w:val="false"/>
-                <w:color w:val="0F2A3D"/>
-                <w:sz w:val="16"/>
-                <w:szCs w:val="16"/>
-              </w:rPr>
-              <w:t xml:space="preserve">-16.0% LOSS</w:t>
+          </w:tcPr>
+          <w:p>
+            <w:r>
+              <w:t>-20.0% LOSS</w:t>
             </w:r>
           </w:p>
         </w:tc>
@@ -6175,170 +4766,50 @@
         <w:tc>
           <w:tcPr>
             <w:tcW w:type="dxa" w:w="2280"/>
-            <w:tcBorders>
-              <w:top w:val="single" w:color="CCCCCC" w:sz="2"/>
-              <w:left w:val="single" w:color="CCCCCC" w:sz="2"/>
-              <w:bottom w:val="single" w:color="CCCCCC" w:sz="2"/>
-              <w:right w:val="single" w:color="CCCCCC" w:sz="2"/>
-            </w:tcBorders>
-            <w:shd w:fill="F0F0F0" w:val="clear"/>
-            <w:tcMar>
-              <w:top w:type="dxa" w:w="80"/>
-              <w:left w:type="dxa" w:w="120"/>
-              <w:bottom w:type="dxa" w:w="80"/>
-              <w:right w:type="dxa" w:w="120"/>
-            </w:tcMar>
-            <w:vAlign w:val="center"/>
-          </w:tcPr>
-          <w:p>
-            <w:pPr>
-              <w:jc w:val="left"/>
-            </w:pPr>
-            <w:r>
-              <w:rPr>
-                <w:b/>
-                <w:bCs/>
-                <w:color w:val="0F2A3D"/>
-                <w:sz w:val="17"/>
-                <w:szCs w:val="17"/>
-              </w:rPr>
-              <w:t xml:space="preserve">Revenue 60% (₦30B)</w:t>
+          </w:tcPr>
+          <w:p>
+            <w:r>
+              <w:t>Revenue 60% (₦24B)</w:t>
             </w:r>
           </w:p>
         </w:tc>
         <w:tc>
           <w:tcPr>
             <w:tcW w:type="dxa" w:w="1950"/>
-            <w:tcBorders>
-              <w:top w:val="single" w:color="CCCCCC" w:sz="2"/>
-              <w:left w:val="single" w:color="CCCCCC" w:sz="2"/>
-              <w:bottom w:val="single" w:color="CCCCCC" w:sz="2"/>
-              <w:right w:val="single" w:color="CCCCCC" w:sz="2"/>
-            </w:tcBorders>
-            <w:shd w:fill="E8F0EA" w:val="clear"/>
-            <w:tcMar>
-              <w:top w:type="dxa" w:w="80"/>
-              <w:left w:type="dxa" w:w="120"/>
-              <w:bottom w:type="dxa" w:w="80"/>
-              <w:right w:type="dxa" w:w="120"/>
-            </w:tcMar>
-            <w:vAlign w:val="center"/>
-          </w:tcPr>
-          <w:p>
-            <w:pPr>
-              <w:jc w:val="center"/>
-            </w:pPr>
-            <w:r>
-              <w:rPr>
-                <w:b w:val="false"/>
-                <w:bCs w:val="false"/>
-                <w:color w:val="0F2A3D"/>
-                <w:sz w:val="16"/>
-                <w:szCs w:val="16"/>
-              </w:rPr>
-              <w:t xml:space="preserve">+71.4% PASS</w:t>
+          </w:tcPr>
+          <w:p>
+            <w:r>
+              <w:t>+37.1% PASS</w:t>
             </w:r>
           </w:p>
         </w:tc>
         <w:tc>
           <w:tcPr>
             <w:tcW w:type="dxa" w:w="1950"/>
-            <w:tcBorders>
-              <w:top w:val="single" w:color="CCCCCC" w:sz="2"/>
-              <w:left w:val="single" w:color="CCCCCC" w:sz="2"/>
-              <w:bottom w:val="single" w:color="CCCCCC" w:sz="2"/>
-              <w:right w:val="single" w:color="CCCCCC" w:sz="2"/>
-            </w:tcBorders>
-            <w:shd w:fill="FBF3DD" w:val="clear"/>
-            <w:tcMar>
-              <w:top w:type="dxa" w:w="80"/>
-              <w:left w:type="dxa" w:w="120"/>
-              <w:bottom w:type="dxa" w:w="80"/>
-              <w:right w:type="dxa" w:w="120"/>
-            </w:tcMar>
-            <w:vAlign w:val="center"/>
-          </w:tcPr>
-          <w:p>
-            <w:pPr>
-              <w:jc w:val="center"/>
-            </w:pPr>
-            <w:r>
-              <w:rPr>
-                <w:b w:val="false"/>
-                <w:bCs w:val="false"/>
-                <w:color w:val="0F2A3D"/>
-                <w:sz w:val="16"/>
-                <w:szCs w:val="16"/>
-              </w:rPr>
-              <w:t xml:space="preserve">+14.3% MARGINAL</w:t>
+          </w:tcPr>
+          <w:p>
+            <w:r>
+              <w:t>-8.6% LOSS</w:t>
             </w:r>
           </w:p>
         </w:tc>
         <w:tc>
           <w:tcPr>
             <w:tcW w:type="dxa" w:w="1950"/>
-            <w:tcBorders>
-              <w:top w:val="single" w:color="CCCCCC" w:sz="2"/>
-              <w:left w:val="single" w:color="CCCCCC" w:sz="2"/>
-              <w:bottom w:val="single" w:color="CCCCCC" w:sz="2"/>
-              <w:right w:val="single" w:color="CCCCCC" w:sz="2"/>
-            </w:tcBorders>
-            <w:shd w:fill="FBE9E9" w:val="clear"/>
-            <w:tcMar>
-              <w:top w:type="dxa" w:w="80"/>
-              <w:left w:type="dxa" w:w="120"/>
-              <w:bottom w:type="dxa" w:w="80"/>
-              <w:right w:type="dxa" w:w="120"/>
-            </w:tcMar>
-            <w:vAlign w:val="center"/>
-          </w:tcPr>
-          <w:p>
-            <w:pPr>
-              <w:jc w:val="center"/>
-            </w:pPr>
-            <w:r>
-              <w:rPr>
-                <w:b w:val="false"/>
-                <w:bCs w:val="false"/>
-                <w:color w:val="0F2A3D"/>
-                <w:sz w:val="16"/>
-                <w:szCs w:val="16"/>
-              </w:rPr>
-              <w:t xml:space="preserve">-14.3% LOSS</w:t>
+          </w:tcPr>
+          <w:p>
+            <w:r>
+              <w:t>-28.0% LOSS</w:t>
             </w:r>
           </w:p>
         </w:tc>
         <w:tc>
           <w:tcPr>
             <w:tcW w:type="dxa" w:w="1950"/>
-            <w:tcBorders>
-              <w:top w:val="single" w:color="CCCCCC" w:sz="2"/>
-              <w:left w:val="single" w:color="CCCCCC" w:sz="2"/>
-              <w:bottom w:val="single" w:color="CCCCCC" w:sz="2"/>
-              <w:right w:val="single" w:color="CCCCCC" w:sz="2"/>
-            </w:tcBorders>
-            <w:shd w:fill="FBE9E9" w:val="clear"/>
-            <w:tcMar>
-              <w:top w:type="dxa" w:w="80"/>
-              <w:left w:type="dxa" w:w="120"/>
-              <w:bottom w:type="dxa" w:w="80"/>
-              <w:right w:type="dxa" w:w="120"/>
-            </w:tcMar>
-            <w:vAlign w:val="center"/>
-          </w:tcPr>
-          <w:p>
-            <w:pPr>
-              <w:jc w:val="center"/>
-            </w:pPr>
-            <w:r>
-              <w:rPr>
-                <w:b w:val="false"/>
-                <w:bCs w:val="false"/>
-                <w:color w:val="0F2A3D"/>
-                <w:sz w:val="16"/>
-                <w:szCs w:val="16"/>
-              </w:rPr>
-              <w:t xml:space="preserve">-28.0% LOSS</w:t>
+          </w:tcPr>
+          <w:p>
+            <w:r>
+              <w:t>-31.4% LOSS</w:t>
             </w:r>
           </w:p>
         </w:tc>
@@ -6384,7 +4855,7 @@
         <w:jc w:val="both"/>
       </w:pPr>
       <w:r>
-        <w:t xml:space="preserve">The confirmed ₦100,000,000 price for a 500 sqm site-and-serviced plot (₦200,000/sqm, Section 9.2) is the basis for the ₦50 billion Phase 1 revenue target: 500 such plots sold across roughly 25 hectares of the residential zone. This is a firmer basis than a top-line revenue figure alone, and is comfortably below the ₦150M duplex carcass-construction cost used elsewhere in this plan for a similarly-sized 500 sqm plot — as expected, since raw serviced land should price below a fully-built structure on the same footprint.</w:t>
+        <w:t>The confirmed ₦100,000,000 price for a 500 sqm site-and-serviced plot (₦200,000/sqm, Section 9.2) is the basis for the ₦12 billion plot-sale component of the ₦40 billion Phase 1 revenue target: 120 such plots sold within the corrected, FCDA-compliant 11-hectare residential zone, after the mandatory 25% statutory infrastructure reserve (Section 3) and the 100 duplexes' own 5-hectare footprint are both accounted for. The illustrative ₦280,000,000 duplex sale price (Section 9.2 note) is built up as ₦100M land-value basis + ₦150M carcass-construction cost + a conservative ₦30M (12%) developer margin — comfortably above the ₦150M duplex carcass-construction cost alone, as expected, since a fully-built structure should price well above raw serviced land on the same footprint.</w:t>
       </w:r>
     </w:p>
     <w:p>
@@ -6422,7 +4893,7 @@
         <w:spacing w:after="90"/>
       </w:pPr>
       <w:r>
-        <w:t xml:space="preserve">The realistic base case, even allowing for a 50% cost overrun (≈90%–186% ROI, first two columns of the matrix above), sits far above the 20% survival floor — the floor is a stress-test boundary, not the expected outcome.</w:t>
+        <w:t>The realistic base case, even allowing for a 50% cost overrun (≈52%–129% ROI, first two columns of the matrix above), sits above the 20% survival floor — the floor is a stress-test boundary, not the expected outcome, though the margin of safety is narrower than in the pre-correction model given the reduced plot count.</w:t>
       </w:r>
     </w:p>
     <w:p>
@@ -6748,7 +5219,7 @@
         <w:spacing w:after="90"/>
       </w:pPr>
       <w:r>
-        <w:t xml:space="preserve">Site-and-serviced plots released in tranches rather than all at once, supporting price appreciation across the ₦50 billion Phase 1 land-sale target as early tranches sell out.</w:t>
+        <w:t>Site-and-serviced plots released in tranches rather than all at once, supporting price appreciation across the ₦40 billion Phase 1 target (plots + duplexes) as early tranches sell out.</w:t>
       </w:r>
     </w:p>
     <w:p>
@@ -6985,86 +5456,16 @@
             </w:tcMar>
           </w:tcPr>
           <w:p>
-            <w:pPr>
-              <w:spacing w:after="100"/>
-            </w:pPr>
-            <w:r>
-              <w:rPr>
-                <w:b/>
-                <w:bCs/>
-                <w:color w:val="0F2A3D"/>
-                <w:sz w:val="22"/>
-                <w:szCs w:val="22"/>
-              </w:rPr>
-              <w:t xml:space="preserve">Strengths</w:t>
-            </w:r>
-          </w:p>
-          <w:p>
-            <w:pPr>
-              <w:pStyle w:val="ListParagraph"/>
-              <w:numPr>
-                <w:ilvl w:val="0"/>
-                <w:numId w:val="2"/>
-              </w:numPr>
-              <w:spacing w:after="60"/>
-            </w:pPr>
-            <w:r>
-              <w:rPr>
-                <w:sz w:val="19"/>
-                <w:szCs w:val="19"/>
-              </w:rPr>
-              <w:t xml:space="preserve">Genuine golf-course anchor — rare in the Abuja market</w:t>
-            </w:r>
-          </w:p>
-          <w:p>
-            <w:pPr>
-              <w:pStyle w:val="ListParagraph"/>
-              <w:numPr>
-                <w:ilvl w:val="0"/>
-                <w:numId w:val="2"/>
-              </w:numPr>
-              <w:spacing w:after="60"/>
-            </w:pPr>
-            <w:r>
-              <w:rPr>
-                <w:sz w:val="19"/>
-                <w:szCs w:val="19"/>
-              </w:rPr>
-              <w:t xml:space="preserve">Phased, self-funding structure limits upfront capital exposure</w:t>
-            </w:r>
-          </w:p>
-          <w:p>
-            <w:pPr>
-              <w:pStyle w:val="ListParagraph"/>
-              <w:numPr>
-                <w:ilvl w:val="0"/>
-                <w:numId w:val="2"/>
-              </w:numPr>
-              <w:spacing w:after="60"/>
-            </w:pPr>
-            <w:r>
-              <w:rPr>
-                <w:sz w:val="19"/>
-                <w:szCs w:val="19"/>
-              </w:rPr>
-              <w:t xml:space="preserve">Four-pillar concept (Live/Work/Heal/Relax) broadens the buyer base</w:t>
-            </w:r>
-          </w:p>
-          <w:p>
-            <w:pPr>
-              <w:pStyle w:val="ListParagraph"/>
-              <w:numPr>
-                <w:ilvl w:val="0"/>
-                <w:numId w:val="2"/>
-              </w:numPr>
-              <w:spacing w:after="60"/>
-            </w:pPr>
-            <w:r>
-              <w:rPr>
-                <w:sz w:val="19"/>
-                <w:szCs w:val="19"/>
-              </w:rPr>
-              <w:t xml:space="preserve">₦50B revenue target is anchored in a concrete, benchmarked unit price (₦100M / ₦200,000 per sqm for a 500 sqm serviced plot, Section 9.2), not an unsupported top-line figure</w:t>
+            <w:r>
+              <w:t>Strengths</w:t>
+              <w:br/>
+              <w:t>Genuine golf-course anchor — rare in the Abuja market</w:t>
+              <w:br/>
+              <w:t>Phased, self-funding structure limits upfront capital exposure</w:t>
+              <w:br/>
+              <w:t>Four-pillar concept (Live/Work/Heal/Relax) broadens the buyer base</w:t>
+              <w:br/>
+              <w:t>₦40B Phase 1 revenue target (₦12B plot sales + ₦28B duplex sales) is anchored in concrete, benchmarked unit pricing (Section 9.2), and the land use is now fully FCDA-compliant (25% statutory infrastructure reserve)</w:t>
             </w:r>
           </w:p>
         </w:tc>
@@ -7086,86 +5487,16 @@
             </w:tcMar>
           </w:tcPr>
           <w:p>
-            <w:pPr>
-              <w:spacing w:after="100"/>
-            </w:pPr>
-            <w:r>
-              <w:rPr>
-                <w:b/>
-                <w:bCs/>
-                <w:color w:val="0F2A3D"/>
-                <w:sz w:val="22"/>
-                <w:szCs w:val="22"/>
-              </w:rPr>
-              <w:t xml:space="preserve">Weaknesses</w:t>
-            </w:r>
-          </w:p>
-          <w:p>
-            <w:pPr>
-              <w:pStyle w:val="ListParagraph"/>
-              <w:numPr>
-                <w:ilvl w:val="0"/>
-                <w:numId w:val="2"/>
-              </w:numPr>
-              <w:spacing w:after="60"/>
-            </w:pPr>
-            <w:r>
-              <w:rPr>
-                <w:sz w:val="19"/>
-                <w:szCs w:val="19"/>
-              </w:rPr>
-              <w:t xml:space="preserve">27 ha golf course uses a resort-style routing, not full championship length</w:t>
-            </w:r>
-          </w:p>
-          <w:p>
-            <w:pPr>
-              <w:pStyle w:val="ListParagraph"/>
-              <w:numPr>
-                <w:ilvl w:val="0"/>
-                <w:numId w:val="2"/>
-              </w:numPr>
-              <w:spacing w:after="60"/>
-            </w:pPr>
-            <w:r>
-              <w:rPr>
-                <w:sz w:val="19"/>
-                <w:szCs w:val="19"/>
-              </w:rPr>
-              <w:t xml:space="preserve">Several revenue lines (duplex sales, Phase 2/3 income) are not yet priced</w:t>
-            </w:r>
-          </w:p>
-          <w:p>
-            <w:pPr>
-              <w:pStyle w:val="ListParagraph"/>
-              <w:numPr>
-                <w:ilvl w:val="0"/>
-                <w:numId w:val="2"/>
-              </w:numPr>
-              <w:spacing w:after="60"/>
-            </w:pPr>
-            <w:r>
-              <w:rPr>
-                <w:sz w:val="19"/>
-                <w:szCs w:val="19"/>
-              </w:rPr>
-              <w:t xml:space="preserve">Dependent on land title perfection and FCDA approvals before launch</w:t>
-            </w:r>
-          </w:p>
-          <w:p>
-            <w:pPr>
-              <w:pStyle w:val="ListParagraph"/>
-              <w:numPr>
-                <w:ilvl w:val="0"/>
-                <w:numId w:val="2"/>
-              </w:numPr>
-              <w:spacing w:after="60"/>
-            </w:pPr>
-            <w:r>
-              <w:rPr>
-                <w:sz w:val="19"/>
-                <w:szCs w:val="19"/>
-              </w:rPr>
-              <w:t xml:space="preserve">500 modeled plots (~25 ha) plus the 100 duplexes (~5 ha) run slightly above the 22 ha residential zone in Section 3 — final plot count/zoning needs survey confirmation</w:t>
+            <w:r>
+              <w:t>Weaknesses</w:t>
+              <w:br/>
+              <w:t>27 ha golf course uses a resort-style routing, not full championship length</w:t>
+              <w:br/>
+              <w:t>Phase 2/3 income (hotel, retail, hospital, school) is not yet priced</w:t>
+              <w:br/>
+              <w:t>Dependent on land title perfection and FCDA approvals before launch</w:t>
+              <w:br/>
+              <w:t>Correcting the FCDA-compliant 25% infrastructure reserve cut net residential land from 22 ha to 11 ha, shrinking the modeled serviced-plot count from 500 to 120 — offset by counting duplex sales in the base case for the first time</w:t>
             </w:r>
           </w:p>
         </w:tc>
@@ -7634,6 +5965,30 @@
             <w:vAlign w:val="center"/>
           </w:tcPr>
           <w:p>
+            <w:r>
+              <w:t>Golf course, clubhouse &amp; infrastructure costs exceed the ₦15.83B buffer</w:t>
+            </w:r>
+          </w:p>
+        </w:tc>
+        <w:tc>
+          <w:tcPr>
+            <w:tcW w:type="dxa" w:w="3880"/>
+            <w:tcBorders>
+              <w:top w:val="single" w:color="CCCCCC" w:sz="2"/>
+              <w:left w:val="single" w:color="CCCCCC" w:sz="2"/>
+              <w:bottom w:val="single" w:color="CCCCCC" w:sz="2"/>
+              <w:right w:val="single" w:color="CCCCCC" w:sz="2"/>
+            </w:tcBorders>
+            <w:shd w:fill="FFFFFF" w:val="clear"/>
+            <w:tcMar>
+              <w:top w:type="dxa" w:w="80"/>
+              <w:left w:type="dxa" w:w="120"/>
+              <w:bottom w:type="dxa" w:w="80"/>
+              <w:right w:type="dxa" w:w="120"/>
+            </w:tcMar>
+            <w:vAlign w:val="center"/>
+          </w:tcPr>
+          <w:p>
             <w:pPr>
               <w:jc w:val="left"/>
             </w:pPr>
@@ -7645,20 +6000,56 @@
                 <w:sz w:val="20"/>
                 <w:szCs w:val="20"/>
               </w:rPr>
-              <w:t xml:space="preserve">Golf course, clubhouse &amp; infrastructure costs exceed the ₦24.17B buffer</w:t>
-            </w:r>
-          </w:p>
-        </w:tc>
-        <w:tc>
-          <w:tcPr>
-            <w:tcW w:type="dxa" w:w="3880"/>
-            <w:tcBorders>
-              <w:top w:val="single" w:color="CCCCCC" w:sz="2"/>
-              <w:left w:val="single" w:color="CCCCCC" w:sz="2"/>
-              <w:bottom w:val="single" w:color="CCCCCC" w:sz="2"/>
-              <w:right w:val="single" w:color="CCCCCC" w:sz="2"/>
-            </w:tcBorders>
-            <w:shd w:fill="FFFFFF" w:val="clear"/>
+              <w:t xml:space="preserve">Lock in costs via a detailed QS costing and fixed-price contracts before Phase 1 groundbreaking</w:t>
+            </w:r>
+          </w:p>
+        </w:tc>
+      </w:tr>
+      <w:tr>
+        <w:tc>
+          <w:tcPr>
+            <w:tcW w:type="dxa" w:w="2600"/>
+            <w:tcBorders>
+              <w:top w:val="single" w:color="CCCCCC" w:sz="2"/>
+              <w:left w:val="single" w:color="CCCCCC" w:sz="2"/>
+              <w:bottom w:val="single" w:color="CCCCCC" w:sz="2"/>
+              <w:right w:val="single" w:color="CCCCCC" w:sz="2"/>
+            </w:tcBorders>
+            <w:shd w:fill="F7F7F7" w:val="clear"/>
+            <w:tcMar>
+              <w:top w:type="dxa" w:w="80"/>
+              <w:left w:type="dxa" w:w="120"/>
+              <w:bottom w:type="dxa" w:w="80"/>
+              <w:right w:type="dxa" w:w="120"/>
+            </w:tcMar>
+            <w:vAlign w:val="center"/>
+          </w:tcPr>
+          <w:p>
+            <w:pPr>
+              <w:jc w:val="left"/>
+            </w:pPr>
+            <w:r>
+              <w:rPr>
+                <w:b/>
+                <w:bCs/>
+                <w:color w:val="0F2A3D"/>
+                <w:sz w:val="20"/>
+                <w:szCs w:val="20"/>
+              </w:rPr>
+              <w:t xml:space="preserve">Sales/off-take risk</w:t>
+            </w:r>
+          </w:p>
+        </w:tc>
+        <w:tc>
+          <w:tcPr>
+            <w:tcW w:type="dxa" w:w="3600"/>
+            <w:tcBorders>
+              <w:top w:val="single" w:color="CCCCCC" w:sz="2"/>
+              <w:left w:val="single" w:color="CCCCCC" w:sz="2"/>
+              <w:bottom w:val="single" w:color="CCCCCC" w:sz="2"/>
+              <w:right w:val="single" w:color="CCCCCC" w:sz="2"/>
+            </w:tcBorders>
+            <w:shd w:fill="F7F7F7" w:val="clear"/>
             <w:tcMar>
               <w:top w:type="dxa" w:w="80"/>
               <w:left w:type="dxa" w:w="120"/>
@@ -7679,7 +6070,41 @@
                 <w:sz w:val="20"/>
                 <w:szCs w:val="20"/>
               </w:rPr>
-              <w:t xml:space="preserve">Lock in costs via a detailed QS costing and fixed-price contracts before Phase 1 groundbreaking</w:t>
+              <w:t xml:space="preserve">Site-and-serviced plots or duplexes sell slower than the 12-month Phase 1 target</w:t>
+            </w:r>
+          </w:p>
+        </w:tc>
+        <w:tc>
+          <w:tcPr>
+            <w:tcW w:type="dxa" w:w="3880"/>
+            <w:tcBorders>
+              <w:top w:val="single" w:color="CCCCCC" w:sz="2"/>
+              <w:left w:val="single" w:color="CCCCCC" w:sz="2"/>
+              <w:bottom w:val="single" w:color="CCCCCC" w:sz="2"/>
+              <w:right w:val="single" w:color="CCCCCC" w:sz="2"/>
+            </w:tcBorders>
+            <w:shd w:fill="F7F7F7" w:val="clear"/>
+            <w:tcMar>
+              <w:top w:type="dxa" w:w="80"/>
+              <w:left w:type="dxa" w:w="120"/>
+              <w:bottom w:type="dxa" w:w="80"/>
+              <w:right w:type="dxa" w:w="120"/>
+            </w:tcMar>
+            <w:vAlign w:val="center"/>
+          </w:tcPr>
+          <w:p>
+            <w:pPr>
+              <w:jc w:val="left"/>
+            </w:pPr>
+            <w:r>
+              <w:rPr>
+                <w:b w:val="false"/>
+                <w:bCs w:val="false"/>
+                <w:color w:val="0F2A3D"/>
+                <w:sz w:val="20"/>
+                <w:szCs w:val="20"/>
+              </w:rPr>
+              <w:t xml:space="preserve">Phased release of plots/units rather than a single launch; pre-sales and diaspora marketing ahead of construction completion</w:t>
             </w:r>
           </w:p>
         </w:tc>
@@ -7694,7 +6119,7 @@
               <w:bottom w:val="single" w:color="CCCCCC" w:sz="2"/>
               <w:right w:val="single" w:color="CCCCCC" w:sz="2"/>
             </w:tcBorders>
-            <w:shd w:fill="F7F7F7" w:val="clear"/>
+            <w:shd w:fill="FFFFFF" w:val="clear"/>
             <w:tcMar>
               <w:top w:type="dxa" w:w="80"/>
               <w:left w:type="dxa" w:w="120"/>
@@ -7715,7 +6140,7 @@
                 <w:sz w:val="20"/>
                 <w:szCs w:val="20"/>
               </w:rPr>
-              <w:t xml:space="preserve">Sales/off-take risk</w:t>
+              <w:t xml:space="preserve">Infrastructure &amp; utilities</w:t>
             </w:r>
           </w:p>
         </w:tc>
@@ -7728,7 +6153,7 @@
               <w:bottom w:val="single" w:color="CCCCCC" w:sz="2"/>
               <w:right w:val="single" w:color="CCCCCC" w:sz="2"/>
             </w:tcBorders>
-            <w:shd w:fill="F7F7F7" w:val="clear"/>
+            <w:shd w:fill="FFFFFF" w:val="clear"/>
             <w:tcMar>
               <w:top w:type="dxa" w:w="80"/>
               <w:left w:type="dxa" w:w="120"/>
@@ -7749,7 +6174,7 @@
                 <w:sz w:val="20"/>
                 <w:szCs w:val="20"/>
               </w:rPr>
-              <w:t xml:space="preserve">Site-and-serviced plots or duplexes sell slower than the 12-month Phase 1 target</w:t>
+              <w:t xml:space="preserve">Off-site power, water or road access delays impact handover timelines</w:t>
             </w:r>
           </w:p>
         </w:tc>
@@ -7762,7 +6187,7 @@
               <w:bottom w:val="single" w:color="CCCCCC" w:sz="2"/>
               <w:right w:val="single" w:color="CCCCCC" w:sz="2"/>
             </w:tcBorders>
-            <w:shd w:fill="F7F7F7" w:val="clear"/>
+            <w:shd w:fill="FFFFFF" w:val="clear"/>
             <w:tcMar>
               <w:top w:type="dxa" w:w="80"/>
               <w:left w:type="dxa" w:w="120"/>
@@ -7783,7 +6208,7 @@
                 <w:sz w:val="20"/>
                 <w:szCs w:val="20"/>
               </w:rPr>
-              <w:t xml:space="preserve">Phased release of plots/units rather than a single launch; pre-sales and diaspora marketing ahead of construction completion</w:t>
+              <w:t xml:space="preserve">Engage FCT/Bwari authorities early; budget for independent solar/borehole solutions as a fallback</w:t>
             </w:r>
           </w:p>
         </w:tc>
@@ -7798,7 +6223,7 @@
               <w:bottom w:val="single" w:color="CCCCCC" w:sz="2"/>
               <w:right w:val="single" w:color="CCCCCC" w:sz="2"/>
             </w:tcBorders>
-            <w:shd w:fill="FFFFFF" w:val="clear"/>
+            <w:shd w:fill="F7F7F7" w:val="clear"/>
             <w:tcMar>
               <w:top w:type="dxa" w:w="80"/>
               <w:left w:type="dxa" w:w="120"/>
@@ -7819,7 +6244,7 @@
                 <w:sz w:val="20"/>
                 <w:szCs w:val="20"/>
               </w:rPr>
-              <w:t xml:space="preserve">Infrastructure &amp; utilities</w:t>
+              <w:t xml:space="preserve">Financing &amp; cash flow</w:t>
             </w:r>
           </w:p>
         </w:tc>
@@ -7832,7 +6257,7 @@
               <w:bottom w:val="single" w:color="CCCCCC" w:sz="2"/>
               <w:right w:val="single" w:color="CCCCCC" w:sz="2"/>
             </w:tcBorders>
-            <w:shd w:fill="FFFFFF" w:val="clear"/>
+            <w:shd w:fill="F7F7F7" w:val="clear"/>
             <w:tcMar>
               <w:top w:type="dxa" w:w="80"/>
               <w:left w:type="dxa" w:w="120"/>
@@ -7853,7 +6278,7 @@
                 <w:sz w:val="20"/>
                 <w:szCs w:val="20"/>
               </w:rPr>
-              <w:t xml:space="preserve">Off-site power, water or road access delays impact handover timelines</w:t>
+              <w:t xml:space="preserve">Timing mismatch between land-sale receipts and construction payment schedules</w:t>
             </w:r>
           </w:p>
         </w:tc>
@@ -7866,7 +6291,7 @@
               <w:bottom w:val="single" w:color="CCCCCC" w:sz="2"/>
               <w:right w:val="single" w:color="CCCCCC" w:sz="2"/>
             </w:tcBorders>
-            <w:shd w:fill="FFFFFF" w:val="clear"/>
+            <w:shd w:fill="F7F7F7" w:val="clear"/>
             <w:tcMar>
               <w:top w:type="dxa" w:w="80"/>
               <w:left w:type="dxa" w:w="120"/>
@@ -7887,7 +6312,7 @@
                 <w:sz w:val="20"/>
                 <w:szCs w:val="20"/>
               </w:rPr>
-              <w:t xml:space="preserve">Engage FCT/Bwari authorities early; budget for independent solar/borehole solutions as a fallback</w:t>
+              <w:t xml:space="preserve">Structure buyer payment plans (deposit + installments tied to construction milestones) to smooth cash flow</w:t>
             </w:r>
           </w:p>
         </w:tc>
@@ -7902,7 +6327,7 @@
               <w:bottom w:val="single" w:color="CCCCCC" w:sz="2"/>
               <w:right w:val="single" w:color="CCCCCC" w:sz="2"/>
             </w:tcBorders>
-            <w:shd w:fill="F7F7F7" w:val="clear"/>
+            <w:shd w:fill="FFFFFF" w:val="clear"/>
             <w:tcMar>
               <w:top w:type="dxa" w:w="80"/>
               <w:left w:type="dxa" w:w="120"/>
@@ -7923,7 +6348,7 @@
                 <w:sz w:val="20"/>
                 <w:szCs w:val="20"/>
               </w:rPr>
-              <w:t xml:space="preserve">Financing &amp; cash flow</w:t>
+              <w:t xml:space="preserve">Market/macroeconomic</w:t>
             </w:r>
           </w:p>
         </w:tc>
@@ -7936,7 +6361,7 @@
               <w:bottom w:val="single" w:color="CCCCCC" w:sz="2"/>
               <w:right w:val="single" w:color="CCCCCC" w:sz="2"/>
             </w:tcBorders>
-            <w:shd w:fill="F7F7F7" w:val="clear"/>
+            <w:shd w:fill="FFFFFF" w:val="clear"/>
             <w:tcMar>
               <w:top w:type="dxa" w:w="80"/>
               <w:left w:type="dxa" w:w="120"/>
@@ -7957,7 +6382,7 @@
                 <w:sz w:val="20"/>
                 <w:szCs w:val="20"/>
               </w:rPr>
-              <w:t xml:space="preserve">Timing mismatch between land-sale receipts and construction payment schedules</w:t>
+              <w:t xml:space="preserve">Currency depreciation or inflation raises input costs faster than sales prices adjust</w:t>
             </w:r>
           </w:p>
         </w:tc>
@@ -7970,7 +6395,7 @@
               <w:bottom w:val="single" w:color="CCCCCC" w:sz="2"/>
               <w:right w:val="single" w:color="CCCCCC" w:sz="2"/>
             </w:tcBorders>
-            <w:shd w:fill="F7F7F7" w:val="clear"/>
+            <w:shd w:fill="FFFFFF" w:val="clear"/>
             <w:tcMar>
               <w:top w:type="dxa" w:w="80"/>
               <w:left w:type="dxa" w:w="120"/>
@@ -7991,110 +6416,6 @@
                 <w:sz w:val="20"/>
                 <w:szCs w:val="20"/>
               </w:rPr>
-              <w:t xml:space="preserve">Structure buyer payment plans (deposit + installments tied to construction milestones) to smooth cash flow</w:t>
-            </w:r>
-          </w:p>
-        </w:tc>
-      </w:tr>
-      <w:tr>
-        <w:tc>
-          <w:tcPr>
-            <w:tcW w:type="dxa" w:w="2600"/>
-            <w:tcBorders>
-              <w:top w:val="single" w:color="CCCCCC" w:sz="2"/>
-              <w:left w:val="single" w:color="CCCCCC" w:sz="2"/>
-              <w:bottom w:val="single" w:color="CCCCCC" w:sz="2"/>
-              <w:right w:val="single" w:color="CCCCCC" w:sz="2"/>
-            </w:tcBorders>
-            <w:shd w:fill="FFFFFF" w:val="clear"/>
-            <w:tcMar>
-              <w:top w:type="dxa" w:w="80"/>
-              <w:left w:type="dxa" w:w="120"/>
-              <w:bottom w:type="dxa" w:w="80"/>
-              <w:right w:type="dxa" w:w="120"/>
-            </w:tcMar>
-            <w:vAlign w:val="center"/>
-          </w:tcPr>
-          <w:p>
-            <w:pPr>
-              <w:jc w:val="left"/>
-            </w:pPr>
-            <w:r>
-              <w:rPr>
-                <w:b/>
-                <w:bCs/>
-                <w:color w:val="0F2A3D"/>
-                <w:sz w:val="20"/>
-                <w:szCs w:val="20"/>
-              </w:rPr>
-              <w:t xml:space="preserve">Market/macroeconomic</w:t>
-            </w:r>
-          </w:p>
-        </w:tc>
-        <w:tc>
-          <w:tcPr>
-            <w:tcW w:type="dxa" w:w="3600"/>
-            <w:tcBorders>
-              <w:top w:val="single" w:color="CCCCCC" w:sz="2"/>
-              <w:left w:val="single" w:color="CCCCCC" w:sz="2"/>
-              <w:bottom w:val="single" w:color="CCCCCC" w:sz="2"/>
-              <w:right w:val="single" w:color="CCCCCC" w:sz="2"/>
-            </w:tcBorders>
-            <w:shd w:fill="FFFFFF" w:val="clear"/>
-            <w:tcMar>
-              <w:top w:type="dxa" w:w="80"/>
-              <w:left w:type="dxa" w:w="120"/>
-              <w:bottom w:type="dxa" w:w="80"/>
-              <w:right w:type="dxa" w:w="120"/>
-            </w:tcMar>
-            <w:vAlign w:val="center"/>
-          </w:tcPr>
-          <w:p>
-            <w:pPr>
-              <w:jc w:val="left"/>
-            </w:pPr>
-            <w:r>
-              <w:rPr>
-                <w:b w:val="false"/>
-                <w:bCs w:val="false"/>
-                <w:color w:val="0F2A3D"/>
-                <w:sz w:val="20"/>
-                <w:szCs w:val="20"/>
-              </w:rPr>
-              <w:t xml:space="preserve">Currency depreciation or inflation raises input costs faster than sales prices adjust</w:t>
-            </w:r>
-          </w:p>
-        </w:tc>
-        <w:tc>
-          <w:tcPr>
-            <w:tcW w:type="dxa" w:w="3880"/>
-            <w:tcBorders>
-              <w:top w:val="single" w:color="CCCCCC" w:sz="2"/>
-              <w:left w:val="single" w:color="CCCCCC" w:sz="2"/>
-              <w:bottom w:val="single" w:color="CCCCCC" w:sz="2"/>
-              <w:right w:val="single" w:color="CCCCCC" w:sz="2"/>
-            </w:tcBorders>
-            <w:shd w:fill="FFFFFF" w:val="clear"/>
-            <w:tcMar>
-              <w:top w:type="dxa" w:w="80"/>
-              <w:left w:type="dxa" w:w="120"/>
-              <w:bottom w:type="dxa" w:w="80"/>
-              <w:right w:type="dxa" w:w="120"/>
-            </w:tcMar>
-            <w:vAlign w:val="center"/>
-          </w:tcPr>
-          <w:p>
-            <w:pPr>
-              <w:jc w:val="left"/>
-            </w:pPr>
-            <w:r>
-              <w:rPr>
-                <w:b w:val="false"/>
-                <w:bCs w:val="false"/>
-                <w:color w:val="0F2A3D"/>
-                <w:sz w:val="20"/>
-                <w:szCs w:val="20"/>
-              </w:rPr>
               <w:t xml:space="preserve">Price a portion of units/plots in USD-indexed terms where legally permissible; review pricing quarterly</w:t>
             </w:r>
           </w:p>
@@ -8328,20 +6649,20 @@
         <w:spacing w:after="90"/>
       </w:pPr>
       <w:r>
-        <w:t xml:space="preserve">Unit count of 100 luxury duplexes is derived from ₦15B total construction cost ÷ ₦150M per unit (to carcass level), as stated in the brief.</w:t>
-      </w:r>
-    </w:p>
-    <w:p>
-      <w:pPr>
-        <w:pStyle w:val="ListParagraph"/>
-        <w:numPr>
-          <w:ilvl w:val="0"/>
-          <w:numId w:val="2"/>
-        </w:numPr>
-        <w:spacing w:after="90"/>
-      </w:pPr>
-      <w:r>
-        <w:t xml:space="preserve">Land use allocation (Section 3) matches Tom’s own conceptual spatial layout for the golf course, golf estate residential zone, hotel and shopping village (27 ha / 22 ha / 4 ha / 4 ha); the clubhouse &amp; sports, hospital, school, gatehouse/security and roads figures are planning allocations for the remaining land, not yet based on a surveyed site plan.</w:t>
+        <w:t>Unit count of 100 luxury duplexes is derived from ₦15B total construction cost ÷ ₦150M per unit (to carcass level), as stated in the brief. The illustrative ₦280M/unit sale price (₦100M land-value basis + ₦150M carcass cost + ₦30M/12% developer margin) is a conservative cost-plus estimate, not a market comparable, and should be firmed up against actual finished-duplex sales in the Bwari/Guzape/Katampe corridor by a licensed valuer before pricing is finalized.</w:t>
+      </w:r>
+    </w:p>
+    <w:p>
+      <w:pPr>
+        <w:pStyle w:val="ListParagraph"/>
+        <w:numPr>
+          <w:ilvl w:val="0"/>
+          <w:numId w:val="2"/>
+        </w:numPr>
+        <w:spacing w:after="90"/>
+      </w:pPr>
+      <w:r>
+        <w:t>Land use allocation (Section 3) keeps Tom’s own conceptual spatial layout for the golf course, hotel and shopping village (27 ha / 4 ha / 4 ha) unchanged; the golf estate residential zone is corrected from 22 ha to 11 ha, and a dedicated 19-hectare Statutory Infrastructure Reserve (25% of the 77-hectare site, per FCDA layout-approval requirements) replaces the previous informal 8-hectare roads/gatehouse allocation. This is now a compliance-driven allocation, not just a planning placeholder, and should still be confirmed once the topographical survey and architectural masterplan are completed.</w:t>
       </w:r>
     </w:p>
     <w:p>
@@ -8367,7 +6688,7 @@
         <w:spacing w:after="90"/>
       </w:pPr>
       <w:r>
-        <w:t xml:space="preserve">The ₦24.17B cost buffer (golf course, clubhouse, infrastructure, marketing, contingency) is a derived ceiling — the maximum spend that still clears the 20% ROI floor on ₦50B revenue — not a bottom-up cost estimate. A full QS costing is recommended before relying on this number for financing decisions.</w:t>
+        <w:t>The ₦15.83B cost buffer (golf course, clubhouse, infrastructure beyond the statutory reserve, marketing, contingency) is a derived ceiling — the maximum spend that still clears the 20% ROI floor on ₦40B revenue — not a bottom-up cost estimate. A full QS costing is recommended before relying on this number for financing decisions.</w:t>
       </w:r>
     </w:p>
     <w:p>

</xml_diff>

<commit_message>
Investor-facing cleanup: remove internal correction history and 'what's held back' framing from business plan + teaser. Final figures unchanged (Phase 1 revenue Rs40B, ROI 128.6%, 11ha residential zone, 19ha statutory infra reserve) — presented as the plan's design, not as a fix.
</commit_message>
<xml_diff>
--- a/golf-estate/The_77_Golf_and_Country_Estate_Business_Plan.docx
+++ b/golf-estate/The_77_Golf_and_Country_Estate_Business_Plan.docx
@@ -38,19 +38,6 @@
           <w:szCs w:val="56"/>
         </w:rPr>
         <w:t xml:space="preserve">THE 77 GOLF &amp; COUNTRY ESTATE</w:t>
-      </w:r>
-    </w:p>
-    <w:p>
-      <w:pPr>
-        <w:jc w:val="left"/>
-      </w:pPr>
-      <w:r>
-        <w:rPr>
-          <w:b/>
-          <w:color w:val="B00000"/>
-          <w:sz w:val="22"/>
-        </w:rPr>
-        <w:t>CORRECTED VERSION — Sep 13, 2026: This revision fixes a material land-use gap in the original draft. The FCDA requires a minimum 25% of gross site area (19 ha of this 77 ha site) reserved for statutory infrastructure (roads, drainage, utilities, public open space) before layout approval — the original draft only allocated 8 ha to this. Correcting it shrinks the Golf Estate Residential zone from 22 ha to 11 ha, cuts the modeled serviced-plot count from 500 to 120, and for the first time brings duplex unit sales into the base-case revenue line (previously excluded) to keep the project viable. Revised Phase 1 base-case revenue: ₦40 billion (was ₦50 billion). Revised ROI: ≈128.6% (was ≈186%). See Section 3 and Section 9–10 for full detail.</w:t>
       </w:r>
     </w:p>
     <w:p>
@@ -1891,7 +1878,7 @@
           <w:sz w:val="18"/>
           <w:szCs w:val="18"/>
         </w:rPr>
-        <w:t>Note: the golf course, hotel and shopping village figures match Tom's independently produced conceptual spatial layout exactly (27 ha / 4 ha / 4 ha). The golf estate residential zone is corrected from Tom's original 22 ha to 11 ha to make room for a proper 19-hectare Statutory Infrastructure Reserve (25% of the 77-hectare site), which the FCDA requires as a condition of layout approval and which the original layout under-allocated (only 8 ha was set aside for roads and gatehouse/security). The clubhouse &amp; sports, hospital and international school figures are reasonable planning allocations for the remaining land and should be confirmed once the topographical survey and architectural masterplan are completed.</w:t>
+        <w:t>Note: the golf course, hotel and shopping village figures match Tom's independently produced conceptual spatial layout exactly (27 ha / 4 ha / 4 ha). The golf estate residential zone is set at 11 ha, alongside a 19-hectare Statutory Infrastructure Reserve (25% of the 77-hectare site) covering roads, drainage, utilities, main gate and security, in line with FCDA layout-approval requirements. The clubhouse &amp; sports, hospital and international school figures are reasonable planning allocations for the remaining land and should be confirmed once the topographical survey and architectural masterplan are completed.</w:t>
       </w:r>
     </w:p>
     <w:p>
@@ -1941,7 +1928,7 @@
         <w:jc w:val="both"/>
       </w:pPr>
       <w:r>
-        <w:t>The Golf Estate Residential zone was originally conceived at 22 hectares, but is corrected in this version to 11 hectares once the FCDA's mandatory statutory infrastructure reserve (a minimum 25% of the full 77-hectare site — roads, drainage, utilities, public open space — Section 3) is properly accounted for. This 11-hectare zone houses the Phase 1 duplex product together with additional site-and-serviced plots released for direct sale (Section 12). Phase 1 residential product itself is 100 units of 4-bedroom luxury duplexes, each on a 500 sqm plot, including:</w:t>
+        <w:t>The 11-hectare Golf Estate Residential zone houses the Phase 1 duplex product together with additional site-and-serviced plots released for direct sale (Section 12). Phase 1 residential product itself is 100 units of 4-bedroom luxury duplexes, each on a 500 sqm plot, including:</w:t>
       </w:r>
     </w:p>
     <w:p>
@@ -3442,7 +3429,7 @@
           </w:tcPr>
           <w:p>
             <w:r>
-              <w:t>Site &amp; Serviced Land Sales — 120 plots × ₦100M (Phase 1, corrected for FCDA-compliant 11 ha residential zone)</w:t>
+              <w:t>Site &amp; Serviced Land Sales — 120 plots × ₦100M (Phase 1, FCDA-compliant 11 ha residential zone)</w:t>
             </w:r>
           </w:p>
         </w:tc>
@@ -3464,7 +3451,7 @@
           </w:tcPr>
           <w:p>
             <w:r>
-              <w:t>Duplex Unit Sales — 100 units × ₦280M illustrative* (now included in base case, see note below)</w:t>
+              <w:t>Duplex Unit Sales — 100 units × ₦280M illustrative* (Section 9.2 note)</w:t>
             </w:r>
           </w:p>
         </w:tc>
@@ -3559,7 +3546,7 @@
           <w:sz w:val="18"/>
           <w:szCs w:val="18"/>
         </w:rPr>
-        <w:t>The ₦40 billion Phase 1 revenue figure (₦12 billion from 120 serviced plots + ₦28 billion from 100 duplex unit sales) is the base-case revenue line for this plan. Duplex sales are now included in the base case for the first time in this corrected version, because the FCDA-compliant 25% statutory infrastructure reserve cuts the net residential land available for plot sales from 500 plots to 120 — plot sales alone are no longer sufficient to cover stated costs, so duplex sale revenue (previously held back as pure additional upside) is now needed to make the base case work, and is priced conservatively (Section 9.2 note). Phase 2/3 hospitality, retail and healthcare income remain real, additional revenue streams but stay excluded from the base-case ROI calculation in Section 10 so the headline return is not overstated.</w:t>
+        <w:t>The ₦40 billion Phase 1 revenue figure (₦12 billion from 120 serviced plots + ₦28 billion from 100 duplex unit sales) is the base-case revenue line for this plan, with both plot sales and duplex unit sales priced conservatively (Section 9.2 note). Phase 2/3 hospitality, retail and healthcare income remain real, additional revenue streams held back entirely from the base-case ROI calculation in Section 10 so the headline return is not overstated.</w:t>
       </w:r>
     </w:p>
     <w:p>
@@ -4855,7 +4842,7 @@
         <w:jc w:val="both"/>
       </w:pPr>
       <w:r>
-        <w:t>The confirmed ₦100,000,000 price for a 500 sqm site-and-serviced plot (₦200,000/sqm, Section 9.2) is the basis for the ₦12 billion plot-sale component of the ₦40 billion Phase 1 revenue target: 120 such plots sold within the corrected, FCDA-compliant 11-hectare residential zone, after the mandatory 25% statutory infrastructure reserve (Section 3) and the 100 duplexes' own 5-hectare footprint are both accounted for. The illustrative ₦280,000,000 duplex sale price (Section 9.2 note) is built up as ₦100M land-value basis + ₦150M carcass-construction cost + a conservative ₦30M (12%) developer margin — comfortably above the ₦150M duplex carcass-construction cost alone, as expected, since a fully-built structure should price well above raw serviced land on the same footprint.</w:t>
+        <w:t>The confirmed ₦100,000,000 price for a 500 sqm site-and-serviced plot (₦200,000/sqm, Section 9.2) is the basis for the ₦12 billion plot-sale component of the ₦40 billion Phase 1 revenue target: 120 such plots sold within the FCDA-compliant 11-hectare residential zone, after the statutory 25% infrastructure reserve (Section 3) and the 100 duplexes' own 5-hectare footprint are both accounted for. The illustrative ₦280,000,000 duplex sale price (Section 9.2 note) is built up as ₦100M land-value basis + ₦150M carcass-construction cost + a conservative ₦30M (12%) developer margin — comfortably above the ₦150M duplex carcass-construction cost alone, as expected, since a fully-built structure should price well above raw serviced land on the same footprint.</w:t>
       </w:r>
     </w:p>
     <w:p>
@@ -4893,7 +4880,7 @@
         <w:spacing w:after="90"/>
       </w:pPr>
       <w:r>
-        <w:t>The realistic base case, even allowing for a 50% cost overrun (≈52%–129% ROI, first two columns of the matrix above), sits above the 20% survival floor — the floor is a stress-test boundary, not the expected outcome, though the margin of safety is narrower than in the pre-correction model given the reduced plot count.</w:t>
+        <w:t>The realistic base case, even allowing for a 50% cost overrun (≈52%–129% ROI, first two columns of the matrix above), sits above the 20% survival floor — the floor is a stress-test boundary, not the expected outcome.</w:t>
       </w:r>
     </w:p>
     <w:p>
@@ -5465,7 +5452,7 @@
               <w:br/>
               <w:t>Four-pillar concept (Live/Work/Heal/Relax) broadens the buyer base</w:t>
               <w:br/>
-              <w:t>₦40B Phase 1 revenue target (₦12B plot sales + ₦28B duplex sales) is anchored in concrete, benchmarked unit pricing (Section 9.2), and the land use is now fully FCDA-compliant (25% statutory infrastructure reserve)</w:t>
+              <w:t>₦40B Phase 1 revenue target (₦12B plot sales + ₦28B duplex sales) is anchored in concrete, benchmarked unit pricing (Section 9.2), on a land-use plan that meets the FCDA's statutory 25% infrastructure-reserve requirement for layout approval</w:t>
             </w:r>
           </w:p>
         </w:tc>
@@ -5496,7 +5483,7 @@
               <w:br/>
               <w:t>Dependent on land title perfection and FCDA approvals before launch</w:t>
               <w:br/>
-              <w:t>Correcting the FCDA-compliant 25% infrastructure reserve cut net residential land from 22 ha to 11 ha, shrinking the modeled serviced-plot count from 500 to 120 — offset by counting duplex sales in the base case for the first time</w:t>
+              <w:t>Duplex sale pricing (₦280M/unit) is an illustrative, cost-plus estimate pending confirmation by a licensed valuer against real market comparables</w:t>
             </w:r>
           </w:p>
         </w:tc>
@@ -6662,7 +6649,7 @@
         <w:spacing w:after="90"/>
       </w:pPr>
       <w:r>
-        <w:t>Land use allocation (Section 3) keeps Tom’s own conceptual spatial layout for the golf course, hotel and shopping village (27 ha / 4 ha / 4 ha) unchanged; the golf estate residential zone is corrected from 22 ha to 11 ha, and a dedicated 19-hectare Statutory Infrastructure Reserve (25% of the 77-hectare site, per FCDA layout-approval requirements) replaces the previous informal 8-hectare roads/gatehouse allocation. This is now a compliance-driven allocation, not just a planning placeholder, and should still be confirmed once the topographical survey and architectural masterplan are completed.</w:t>
+        <w:t>Land use allocation (Section 3) keeps Tom’s own conceptual spatial layout for the golf course, hotel and shopping village (27 ha / 4 ha / 4 ha) unchanged; the golf estate residential zone is set at 11 ha, with a dedicated 19-hectare Statutory Infrastructure Reserve (25% of the 77-hectare site, per FCDA layout-approval requirements) covering roads, drainage, utilities, main gate and security. This allocation should be confirmed once the topographical survey and architectural masterplan are completed.</w:t>
       </w:r>
     </w:p>
     <w:p>

</xml_diff>